<commit_message>
feat: implement 2-stage roadmap, 4-stage pipeline, battleground guide, and runnable src simulation
</commit_message>
<xml_diff>
--- a/Cheat_Detection_System_Specification.docx
+++ b/Cheat_Detection_System_Specification.docx
@@ -11,7 +11,7 @@
           <w:rFonts w:ascii="Arial" w:hAnsi="Arial"/>
           <w:b/>
           <w:color w:val="0F2942"/>
-          <w:sz w:val="56"/>
+          <w:sz w:val="52"/>
         </w:rPr>
         <w:t>CHEAT DETECTION SYSTEM (CDS)</w:t>
       </w:r>
@@ -24,9 +24,9 @@
         <w:rPr>
           <w:rFonts w:ascii="Arial" w:hAnsi="Arial"/>
           <w:color w:val="0284C7"/>
-          <w:sz w:val="28"/>
+          <w:sz w:val="26"/>
         </w:rPr>
-        <w:t>Next-Generation Multi-Modal Anti-Cheat Architecture &amp; Specification</w:t>
+        <w:t>Technical Architecture, Battleground Implementation &amp; Developer Handover</w:t>
       </w:r>
     </w:p>
     <w:tbl>
@@ -48,8 +48,8 @@
             <w:tcMar>
               <w:top w:w="80" w:type="dxa"/>
               <w:bottom w:w="80" w:type="dxa"/>
-              <w:left w:w="120" w:type="dxa"/>
-              <w:right w:w="120" w:type="dxa"/>
+              <w:left w:w="100" w:type="dxa"/>
+              <w:right w:w="100" w:type="dxa"/>
             </w:tcMar>
           </w:tcPr>
           <w:p>
@@ -57,7 +57,232 @@
               <w:rPr>
                 <w:b/>
                 <w:color w:val="0F2942"/>
-                <w:sz w:val="20"/>
+                <w:sz w:val="19"/>
+              </w:rPr>
+              <w:t>Project:</w:t>
+            </w:r>
+          </w:p>
+        </w:tc>
+        <w:tc>
+          <w:tcPr>
+            <w:tcW w:type="dxa" w:w="6192"/>
+            <w:shd w:fill="F8FAFC"/>
+            <w:tcMar>
+              <w:top w:w="80" w:type="dxa"/>
+              <w:bottom w:w="80" w:type="dxa"/>
+              <w:left w:w="100" w:type="dxa"/>
+              <w:right w:w="100" w:type="dxa"/>
+            </w:tcMar>
+          </w:tcPr>
+          <w:p>
+            <w:r>
+              <w:rPr>
+                <w:color w:val="1E293B"/>
+                <w:sz w:val="19"/>
+              </w:rPr>
+              <w:t>Cheat Detection System (CDS)</w:t>
+            </w:r>
+          </w:p>
+        </w:tc>
+      </w:tr>
+      <w:tr>
+        <w:tc>
+          <w:tcPr>
+            <w:tcW w:type="dxa" w:w="3168"/>
+            <w:shd w:fill="F1F5F9"/>
+            <w:tcMar>
+              <w:top w:w="80" w:type="dxa"/>
+              <w:bottom w:w="80" w:type="dxa"/>
+              <w:left w:w="100" w:type="dxa"/>
+              <w:right w:w="100" w:type="dxa"/>
+            </w:tcMar>
+          </w:tcPr>
+          <w:p>
+            <w:r>
+              <w:rPr>
+                <w:b/>
+                <w:color w:val="0F2942"/>
+                <w:sz w:val="19"/>
+              </w:rPr>
+              <w:t>Strategic Roadmap:</w:t>
+            </w:r>
+          </w:p>
+        </w:tc>
+        <w:tc>
+          <w:tcPr>
+            <w:tcW w:type="dxa" w:w="6192"/>
+            <w:shd w:fill="F8FAFC"/>
+            <w:tcMar>
+              <w:top w:w="80" w:type="dxa"/>
+              <w:bottom w:w="80" w:type="dxa"/>
+              <w:left w:w="100" w:type="dxa"/>
+              <w:right w:w="100" w:type="dxa"/>
+            </w:tcMar>
+          </w:tcPr>
+          <w:p>
+            <w:r>
+              <w:rPr>
+                <w:color w:val="1E293B"/>
+                <w:sz w:val="19"/>
+              </w:rPr>
+              <w:t>Stage 1 (Core Analogy Engine) &amp; Stage 2 (Battleground Games)</w:t>
+            </w:r>
+          </w:p>
+        </w:tc>
+      </w:tr>
+      <w:tr>
+        <w:tc>
+          <w:tcPr>
+            <w:tcW w:type="dxa" w:w="3168"/>
+            <w:shd w:fill="F1F5F9"/>
+            <w:tcMar>
+              <w:top w:w="80" w:type="dxa"/>
+              <w:bottom w:w="80" w:type="dxa"/>
+              <w:left w:w="100" w:type="dxa"/>
+              <w:right w:w="100" w:type="dxa"/>
+            </w:tcMar>
+          </w:tcPr>
+          <w:p>
+            <w:r>
+              <w:rPr>
+                <w:b/>
+                <w:color w:val="0F2942"/>
+                <w:sz w:val="19"/>
+              </w:rPr>
+              <w:t>Internal Architecture:</w:t>
+            </w:r>
+          </w:p>
+        </w:tc>
+        <w:tc>
+          <w:tcPr>
+            <w:tcW w:type="dxa" w:w="6192"/>
+            <w:shd w:fill="F8FAFC"/>
+            <w:tcMar>
+              <w:top w:w="80" w:type="dxa"/>
+              <w:bottom w:w="80" w:type="dxa"/>
+              <w:left w:w="100" w:type="dxa"/>
+              <w:right w:w="100" w:type="dxa"/>
+            </w:tcMar>
+          </w:tcPr>
+          <w:p>
+            <w:r>
+              <w:rPr>
+                <w:color w:val="1E293B"/>
+                <w:sz w:val="19"/>
+              </w:rPr>
+              <w:t>4-Stage Triangulation (Passive NLP + Active Telemetry + Profile Agent + Orchestrator)</w:t>
+            </w:r>
+          </w:p>
+        </w:tc>
+      </w:tr>
+      <w:tr>
+        <w:tc>
+          <w:tcPr>
+            <w:tcW w:type="dxa" w:w="3168"/>
+            <w:shd w:fill="F1F5F9"/>
+            <w:tcMar>
+              <w:top w:w="80" w:type="dxa"/>
+              <w:bottom w:w="80" w:type="dxa"/>
+              <w:left w:w="100" w:type="dxa"/>
+              <w:right w:w="100" w:type="dxa"/>
+            </w:tcMar>
+          </w:tcPr>
+          <w:p>
+            <w:r>
+              <w:rPr>
+                <w:b/>
+                <w:color w:val="0F2942"/>
+                <w:sz w:val="19"/>
+              </w:rPr>
+              <w:t>Consensus Engine:</w:t>
+            </w:r>
+          </w:p>
+        </w:tc>
+        <w:tc>
+          <w:tcPr>
+            <w:tcW w:type="dxa" w:w="6192"/>
+            <w:shd w:fill="F8FAFC"/>
+            <w:tcMar>
+              <w:top w:w="80" w:type="dxa"/>
+              <w:bottom w:w="80" w:type="dxa"/>
+              <w:left w:w="100" w:type="dxa"/>
+              <w:right w:w="100" w:type="dxa"/>
+            </w:tcMar>
+          </w:tcPr>
+          <w:p>
+            <w:r>
+              <w:rPr>
+                <w:color w:val="1E293B"/>
+                <w:sz w:val="19"/>
+              </w:rPr>
+              <w:t>3-GRAY Promotion Rule (3x GRAY ===&gt; RED) &amp; 2-GRAY Retention</w:t>
+            </w:r>
+          </w:p>
+        </w:tc>
+      </w:tr>
+      <w:tr>
+        <w:tc>
+          <w:tcPr>
+            <w:tcW w:type="dxa" w:w="3168"/>
+            <w:shd w:fill="F1F5F9"/>
+            <w:tcMar>
+              <w:top w:w="80" w:type="dxa"/>
+              <w:bottom w:w="80" w:type="dxa"/>
+              <w:left w:w="100" w:type="dxa"/>
+              <w:right w:w="100" w:type="dxa"/>
+            </w:tcMar>
+          </w:tcPr>
+          <w:p>
+            <w:r>
+              <w:rPr>
+                <w:b/>
+                <w:color w:val="0F2942"/>
+                <w:sz w:val="19"/>
+              </w:rPr>
+              <w:t>Classification Tiers:</w:t>
+            </w:r>
+          </w:p>
+        </w:tc>
+        <w:tc>
+          <w:tcPr>
+            <w:tcW w:type="dxa" w:w="6192"/>
+            <w:shd w:fill="F8FAFC"/>
+            <w:tcMar>
+              <w:top w:w="80" w:type="dxa"/>
+              <w:bottom w:w="80" w:type="dxa"/>
+              <w:left w:w="100" w:type="dxa"/>
+              <w:right w:w="100" w:type="dxa"/>
+            </w:tcMar>
+          </w:tcPr>
+          <w:p>
+            <w:r>
+              <w:rPr>
+                <w:color w:val="1E293B"/>
+                <w:sz w:val="19"/>
+              </w:rPr>
+              <w:t>GREEN (Free) | GRAY (Monitor) | RED (Ban / Quarantine)</w:t>
+            </w:r>
+          </w:p>
+        </w:tc>
+      </w:tr>
+      <w:tr>
+        <w:tc>
+          <w:tcPr>
+            <w:tcW w:type="dxa" w:w="3168"/>
+            <w:shd w:fill="F1F5F9"/>
+            <w:tcMar>
+              <w:top w:w="80" w:type="dxa"/>
+              <w:bottom w:w="80" w:type="dxa"/>
+              <w:left w:w="100" w:type="dxa"/>
+              <w:right w:w="100" w:type="dxa"/>
+            </w:tcMar>
+          </w:tcPr>
+          <w:p>
+            <w:r>
+              <w:rPr>
+                <w:b/>
+                <w:color w:val="0F2942"/>
+                <w:sz w:val="19"/>
               </w:rPr>
               <w:t>Document Version:</w:t>
             </w:r>
@@ -70,197 +295,17 @@
             <w:tcMar>
               <w:top w:w="80" w:type="dxa"/>
               <w:bottom w:w="80" w:type="dxa"/>
-              <w:left w:w="120" w:type="dxa"/>
-              <w:right w:w="120" w:type="dxa"/>
+              <w:left w:w="100" w:type="dxa"/>
+              <w:right w:w="100" w:type="dxa"/>
             </w:tcMar>
           </w:tcPr>
           <w:p>
             <w:r>
               <w:rPr>
                 <w:color w:val="1E293B"/>
-                <w:sz w:val="20"/>
+                <w:sz w:val="19"/>
               </w:rPr>
-              <w:t>1.0.0-PROPOSAL (Engineering Specification)</w:t>
-            </w:r>
-          </w:p>
-        </w:tc>
-      </w:tr>
-      <w:tr>
-        <w:tc>
-          <w:tcPr>
-            <w:tcW w:type="dxa" w:w="3168"/>
-            <w:shd w:fill="F1F5F9"/>
-            <w:tcMar>
-              <w:top w:w="80" w:type="dxa"/>
-              <w:bottom w:w="80" w:type="dxa"/>
-              <w:left w:w="120" w:type="dxa"/>
-              <w:right w:w="120" w:type="dxa"/>
-            </w:tcMar>
-          </w:tcPr>
-          <w:p>
-            <w:r>
-              <w:rPr>
-                <w:b/>
-                <w:color w:val="0F2942"/>
-                <w:sz w:val="20"/>
-              </w:rPr>
-              <w:t>Classification:</w:t>
-            </w:r>
-          </w:p>
-        </w:tc>
-        <w:tc>
-          <w:tcPr>
-            <w:tcW w:type="dxa" w:w="6192"/>
-            <w:shd w:fill="F8FAFC"/>
-            <w:tcMar>
-              <w:top w:w="80" w:type="dxa"/>
-              <w:bottom w:w="80" w:type="dxa"/>
-              <w:left w:w="120" w:type="dxa"/>
-              <w:right w:w="120" w:type="dxa"/>
-            </w:tcMar>
-          </w:tcPr>
-          <w:p>
-            <w:r>
-              <w:rPr>
-                <w:color w:val="1E293B"/>
-                <w:sz w:val="20"/>
-              </w:rPr>
-              <w:t>Proprietary &amp; Confidential - Source-Available View-Only</w:t>
-            </w:r>
-          </w:p>
-        </w:tc>
-      </w:tr>
-      <w:tr>
-        <w:tc>
-          <w:tcPr>
-            <w:tcW w:type="dxa" w:w="3168"/>
-            <w:shd w:fill="F1F5F9"/>
-            <w:tcMar>
-              <w:top w:w="80" w:type="dxa"/>
-              <w:bottom w:w="80" w:type="dxa"/>
-              <w:left w:w="120" w:type="dxa"/>
-              <w:right w:w="120" w:type="dxa"/>
-            </w:tcMar>
-          </w:tcPr>
-          <w:p>
-            <w:r>
-              <w:rPr>
-                <w:b/>
-                <w:color w:val="0F2942"/>
-                <w:sz w:val="20"/>
-              </w:rPr>
-              <w:t>Core Architecture:</w:t>
-            </w:r>
-          </w:p>
-        </w:tc>
-        <w:tc>
-          <w:tcPr>
-            <w:tcW w:type="dxa" w:w="6192"/>
-            <w:shd w:fill="F8FAFC"/>
-            <w:tcMar>
-              <w:top w:w="80" w:type="dxa"/>
-              <w:bottom w:w="80" w:type="dxa"/>
-              <w:left w:w="120" w:type="dxa"/>
-              <w:right w:w="120" w:type="dxa"/>
-            </w:tcMar>
-          </w:tcPr>
-          <w:p>
-            <w:r>
-              <w:rPr>
-                <w:color w:val="1E293B"/>
-                <w:sz w:val="20"/>
-              </w:rPr>
-              <w:t>3-Tier Hybrid (Passive NLP + Active Anomaly + Agentic Verification)</w:t>
-            </w:r>
-          </w:p>
-        </w:tc>
-      </w:tr>
-      <w:tr>
-        <w:tc>
-          <w:tcPr>
-            <w:tcW w:type="dxa" w:w="3168"/>
-            <w:shd w:fill="F1F5F9"/>
-            <w:tcMar>
-              <w:top w:w="80" w:type="dxa"/>
-              <w:bottom w:w="80" w:type="dxa"/>
-              <w:left w:w="120" w:type="dxa"/>
-              <w:right w:w="120" w:type="dxa"/>
-            </w:tcMar>
-          </w:tcPr>
-          <w:p>
-            <w:r>
-              <w:rPr>
-                <w:b/>
-                <w:color w:val="0F2942"/>
-                <w:sz w:val="20"/>
-              </w:rPr>
-              <w:t>Target Environments:</w:t>
-            </w:r>
-          </w:p>
-        </w:tc>
-        <w:tc>
-          <w:tcPr>
-            <w:tcW w:type="dxa" w:w="6192"/>
-            <w:shd w:fill="F8FAFC"/>
-            <w:tcMar>
-              <w:top w:w="80" w:type="dxa"/>
-              <w:bottom w:w="80" w:type="dxa"/>
-              <w:left w:w="120" w:type="dxa"/>
-              <w:right w:w="120" w:type="dxa"/>
-            </w:tcMar>
-          </w:tcPr>
-          <w:p>
-            <w:r>
-              <w:rPr>
-                <w:color w:val="1E293B"/>
-                <w:sz w:val="20"/>
-              </w:rPr>
-              <w:t>Competitive Multiplayer, Real-Time FPS, MOBA, &amp; Battle Royale</w:t>
-            </w:r>
-          </w:p>
-        </w:tc>
-      </w:tr>
-      <w:tr>
-        <w:tc>
-          <w:tcPr>
-            <w:tcW w:type="dxa" w:w="3168"/>
-            <w:shd w:fill="F1F5F9"/>
-            <w:tcMar>
-              <w:top w:w="80" w:type="dxa"/>
-              <w:bottom w:w="80" w:type="dxa"/>
-              <w:left w:w="120" w:type="dxa"/>
-              <w:right w:w="120" w:type="dxa"/>
-            </w:tcMar>
-          </w:tcPr>
-          <w:p>
-            <w:r>
-              <w:rPr>
-                <w:b/>
-                <w:color w:val="0F2942"/>
-                <w:sz w:val="20"/>
-              </w:rPr>
-              <w:t>Date of Publication:</w:t>
-            </w:r>
-          </w:p>
-        </w:tc>
-        <w:tc>
-          <w:tcPr>
-            <w:tcW w:type="dxa" w:w="6192"/>
-            <w:shd w:fill="F8FAFC"/>
-            <w:tcMar>
-              <w:top w:w="80" w:type="dxa"/>
-              <w:bottom w:w="80" w:type="dxa"/>
-              <w:left w:w="120" w:type="dxa"/>
-              <w:right w:w="120" w:type="dxa"/>
-            </w:tcMar>
-          </w:tcPr>
-          <w:p>
-            <w:r>
-              <w:rPr>
-                <w:color w:val="1E293B"/>
-                <w:sz w:val="20"/>
-              </w:rPr>
-              <w:t>October 2026</w:t>
+              <w:t>2.0.0-PRODUCTION SPECIFICATION (October 2026)</w:t>
             </w:r>
           </w:p>
         </w:tc>
@@ -281,17 +326,18 @@
           <w:rFonts w:ascii="Arial" w:hAnsi="Arial"/>
           <w:b/>
           <w:color w:val="0F2942"/>
-          <w:sz w:val="36"/>
+          <w:sz w:val="32"/>
         </w:rPr>
-        <w:t>1. Executive Summary</w:t>
+        <w:t>1. Strategic Product Roadmap</w:t>
       </w:r>
     </w:p>
     <w:p>
       <w:r>
-        <w:t>The competitive gaming ecosystem is experiencing unprecedented growth, with e-sports viewership and real-money tournament prize pools reaching all-time highs. However, this exponential expansion is critically undermined by the proliferation of sophisticated cheats—including kernel-level direct memory access (DMA) devices, AI-assisted computer vision aimbots running on secondary PCs, and stealth memory injection tools. Traditional signature-based anti-cheat mechanisms fail against polymorphic binaries and external hardware cheats.</w:t>
+        <w:t>The Cheat Detection System (CDS) is engineered across two overarching product stages:</w:t>
         <w:br/>
+        <w:t>• Stage 1 (Core Analogy Engine — Current Development): The core framework, mathematical models, feature scaling pipelines, NLP tokenization engine, and multi-model consensus logic.</w:t>
         <w:br/>
-        <w:t>The Cheat Detection System (CDS) introduces a revolutionary multi-modal behavioral anti-cheat framework that evaluates player actions and performance telemetry rather than relying solely on invasive client-side scans. By fusing three decoupled, fault-tolerant analytical layers—Passive NLP Detection, Active Kinematic Anomaly Detection, and External Agentic Multi-Perspective Verification—CDS detects both conventional hacks and undetectable modern hardware cheats with industry-leading precision and near-zero false positive rates.</w:t>
+        <w:t>• Stage 2 (Modern Battleground Implementation — Next Step): Tailored integration for 100-player Battle Royale / Battleground games (e.g. PUBG, Warzone, Apex, Free Fire) addressing parachuting, open-world terrain elevation, vehicle dynamics, and long-range ballistic gunplay.</w:t>
       </w:r>
     </w:p>
     <w:p>
@@ -304,331 +350,27 @@
           <w:rFonts w:ascii="Arial" w:hAnsi="Arial"/>
           <w:b/>
           <w:color w:val="0F2942"/>
-          <w:sz w:val="36"/>
+          <w:sz w:val="32"/>
         </w:rPr>
-        <w:t>2. Problem Statement &amp; Modern Threat Landscape</w:t>
+        <w:t>2. Developer End: Integration &amp; Onboarding Flow</w:t>
       </w:r>
     </w:p>
     <w:p>
       <w:r>
-        <w:t>Modern cheating technology has evolved far beyond traditional DLL injection or simple Cheat Engine memory modifications. Today's commercial cheat vendors exploit sophisticated loopholes in operating systems and game engines:</w:t>
+        <w:t>Game developers integrate CDS into their production infrastructure through a standardized sequence:</w:t>
+        <w:br/>
+        <w:t>1. Fork Repository &amp; Read Documentation: Developer forks the repository and reviews battleground-implementation.md.</w:t>
+        <w:br/>
+        <w:t>2. Stage 1 Hookup &amp; Cold-Start Training: Developer attaches their game database (Win rate, K/D, Headshot %, DPM), runs feature scaling, and executes training mode with a binary GREEN/RED Answer Key.</w:t>
+        <w:br/>
+        <w:t>3. Stage 2 Hookup: Connects live dedicated server telemetry (speed, height, DPM, live headshots, micro-aim adjustments). Clean players are discarded, reporting only GRAY and RED.</w:t>
+        <w:br/>
+        <w:t>4. Stage 3 Hookup: Connects player profiles and social metadata to the Agentic Profile Inspector to catch cheat sellers advertising on Discord/Telegram. Outputs GREEN/GRAY only.</w:t>
+        <w:br/>
+        <w:t>5. Stage 4 Orchestrator: Balances all models simultaneously, aggregates cross-model GRAY lists, applies the 3-GRAY to RED promotion rule, and delivers final rosters.</w:t>
+        <w:br/>
+        <w:t>6. Developer Handover: Developer frees GREEN players, monitors GRAY players, and bans RED players according to studio policy. CDS holds no responsibility for subsequent moderation decisions.</w:t>
       </w:r>
-    </w:p>
-    <w:tbl>
-      <w:tblPr>
-        <w:tblW w:type="auto" w:w="0"/>
-        <w:jc w:val="center"/>
-        <w:tblLayout w:type="fixed"/>
-        <w:tblLook w:firstColumn="1" w:firstRow="1" w:lastColumn="0" w:lastRow="0" w:noHBand="0" w:noVBand="1" w:val="04A0"/>
-      </w:tblPr>
-      <w:tblGrid>
-        <w:gridCol w:w="3120"/>
-        <w:gridCol w:w="3120"/>
-        <w:gridCol w:w="3120"/>
-      </w:tblGrid>
-      <w:tr>
-        <w:tc>
-          <w:tcPr>
-            <w:tcW w:type="dxa" w:w="3120"/>
-            <w:shd w:fill="0F2942"/>
-          </w:tcPr>
-          <w:p>
-            <w:r>
-              <w:rPr>
-                <w:b/>
-                <w:color w:val="FFFFFF"/>
-                <w:sz w:val="20"/>
-              </w:rPr>
-              <w:t>Cheat Attack Vector</w:t>
-            </w:r>
-          </w:p>
-        </w:tc>
-        <w:tc>
-          <w:tcPr>
-            <w:tcW w:type="dxa" w:w="3120"/>
-            <w:shd w:fill="0F2942"/>
-          </w:tcPr>
-          <w:p>
-            <w:r>
-              <w:rPr>
-                <w:b/>
-                <w:color w:val="FFFFFF"/>
-                <w:sz w:val="20"/>
-              </w:rPr>
-              <w:t>Mechanism of Operation</w:t>
-            </w:r>
-          </w:p>
-        </w:tc>
-        <w:tc>
-          <w:tcPr>
-            <w:tcW w:type="dxa" w:w="3120"/>
-            <w:shd w:fill="0F2942"/>
-          </w:tcPr>
-          <w:p>
-            <w:r>
-              <w:rPr>
-                <w:b/>
-                <w:color w:val="FFFFFF"/>
-                <w:sz w:val="20"/>
-              </w:rPr>
-              <w:t>Traditional Anti-Cheat Blindspot</w:t>
-            </w:r>
-          </w:p>
-        </w:tc>
-      </w:tr>
-      <w:tr>
-        <w:tc>
-          <w:tcPr>
-            <w:tcW w:type="dxa" w:w="2592"/>
-            <w:shd w:fill="FFFFFF"/>
-            <w:tcMar>
-              <w:top w:w="80" w:type="dxa"/>
-              <w:bottom w:w="80" w:type="dxa"/>
-              <w:left w:w="100" w:type="dxa"/>
-              <w:right w:w="100" w:type="dxa"/>
-            </w:tcMar>
-          </w:tcPr>
-          <w:p>
-            <w:r>
-              <w:rPr>
-                <w:sz w:val="19"/>
-              </w:rPr>
-              <w:t>DMA Hardware Cheats</w:t>
-            </w:r>
-          </w:p>
-        </w:tc>
-        <w:tc>
-          <w:tcPr>
-            <w:tcW w:type="dxa" w:w="3600"/>
-            <w:shd w:fill="FFFFFF"/>
-            <w:tcMar>
-              <w:top w:w="80" w:type="dxa"/>
-              <w:bottom w:w="80" w:type="dxa"/>
-              <w:left w:w="100" w:type="dxa"/>
-              <w:right w:w="100" w:type="dxa"/>
-            </w:tcMar>
-          </w:tcPr>
-          <w:p>
-            <w:r>
-              <w:rPr>
-                <w:sz w:val="19"/>
-              </w:rPr>
-              <w:t>PCIe FPGA cards read physical RAM from a secondary PC, bypassing Windows kernel hooks.</w:t>
-            </w:r>
-          </w:p>
-        </w:tc>
-        <w:tc>
-          <w:tcPr>
-            <w:tcW w:type="dxa" w:w="3168"/>
-            <w:shd w:fill="FFFFFF"/>
-            <w:tcMar>
-              <w:top w:w="80" w:type="dxa"/>
-              <w:bottom w:w="80" w:type="dxa"/>
-              <w:left w:w="100" w:type="dxa"/>
-              <w:right w:w="100" w:type="dxa"/>
-            </w:tcMar>
-          </w:tcPr>
-          <w:p>
-            <w:r>
-              <w:rPr>
-                <w:sz w:val="19"/>
-              </w:rPr>
-              <w:t>Client kernel drivers see zero suspicious processes or thread hooks on the gaming machine.</w:t>
-            </w:r>
-          </w:p>
-        </w:tc>
-      </w:tr>
-      <w:tr>
-        <w:tc>
-          <w:tcPr>
-            <w:tcW w:type="dxa" w:w="2592"/>
-            <w:shd w:fill="F8FAFC"/>
-            <w:tcMar>
-              <w:top w:w="80" w:type="dxa"/>
-              <w:bottom w:w="80" w:type="dxa"/>
-              <w:left w:w="100" w:type="dxa"/>
-              <w:right w:w="100" w:type="dxa"/>
-            </w:tcMar>
-          </w:tcPr>
-          <w:p>
-            <w:r>
-              <w:rPr>
-                <w:sz w:val="19"/>
-              </w:rPr>
-              <w:t>Computer Vision Aimbots</w:t>
-            </w:r>
-          </w:p>
-        </w:tc>
-        <w:tc>
-          <w:tcPr>
-            <w:tcW w:type="dxa" w:w="3600"/>
-            <w:shd w:fill="F8FAFC"/>
-            <w:tcMar>
-              <w:top w:w="80" w:type="dxa"/>
-              <w:bottom w:w="80" w:type="dxa"/>
-              <w:left w:w="100" w:type="dxa"/>
-              <w:right w:w="100" w:type="dxa"/>
-            </w:tcMar>
-          </w:tcPr>
-          <w:p>
-            <w:r>
-              <w:rPr>
-                <w:sz w:val="19"/>
-              </w:rPr>
-              <w:t>HDMI capture cards stream display feed to an external machine running YOLO/TensorRT object detection, sending HID mouse inputs.</w:t>
-            </w:r>
-          </w:p>
-        </w:tc>
-        <w:tc>
-          <w:tcPr>
-            <w:tcW w:type="dxa" w:w="3168"/>
-            <w:shd w:fill="F8FAFC"/>
-            <w:tcMar>
-              <w:top w:w="80" w:type="dxa"/>
-              <w:bottom w:w="80" w:type="dxa"/>
-              <w:left w:w="100" w:type="dxa"/>
-              <w:right w:w="100" w:type="dxa"/>
-            </w:tcMar>
-          </w:tcPr>
-          <w:p>
-            <w:r>
-              <w:rPr>
-                <w:sz w:val="19"/>
-              </w:rPr>
-              <w:t>Runs completely off-box without modifying game process memory or game executable binaries.</w:t>
-            </w:r>
-          </w:p>
-        </w:tc>
-      </w:tr>
-      <w:tr>
-        <w:tc>
-          <w:tcPr>
-            <w:tcW w:type="dxa" w:w="2592"/>
-            <w:shd w:fill="FFFFFF"/>
-            <w:tcMar>
-              <w:top w:w="80" w:type="dxa"/>
-              <w:bottom w:w="80" w:type="dxa"/>
-              <w:left w:w="100" w:type="dxa"/>
-              <w:right w:w="100" w:type="dxa"/>
-            </w:tcMar>
-          </w:tcPr>
-          <w:p>
-            <w:r>
-              <w:rPr>
-                <w:sz w:val="19"/>
-              </w:rPr>
-              <w:t>Micro-Smoothing &amp; Humanized Aim</w:t>
-            </w:r>
-          </w:p>
-        </w:tc>
-        <w:tc>
-          <w:tcPr>
-            <w:tcW w:type="dxa" w:w="3600"/>
-            <w:shd w:fill="FFFFFF"/>
-            <w:tcMar>
-              <w:top w:w="80" w:type="dxa"/>
-              <w:bottom w:w="80" w:type="dxa"/>
-              <w:left w:w="100" w:type="dxa"/>
-              <w:right w:w="100" w:type="dxa"/>
-            </w:tcMar>
-          </w:tcPr>
-          <w:p>
-            <w:r>
-              <w:rPr>
-                <w:sz w:val="19"/>
-              </w:rPr>
-              <w:t>Aimbots emulate human hand jitter, Bezier curves, and reaction time distributions.</w:t>
-            </w:r>
-          </w:p>
-        </w:tc>
-        <w:tc>
-          <w:tcPr>
-            <w:tcW w:type="dxa" w:w="3168"/>
-            <w:shd w:fill="FFFFFF"/>
-            <w:tcMar>
-              <w:top w:w="80" w:type="dxa"/>
-              <w:bottom w:w="80" w:type="dxa"/>
-              <w:left w:w="100" w:type="dxa"/>
-              <w:right w:w="100" w:type="dxa"/>
-            </w:tcMar>
-          </w:tcPr>
-          <w:p>
-            <w:r>
-              <w:rPr>
-                <w:sz w:val="19"/>
-              </w:rPr>
-              <w:t>Simple threshold filters and standard deviation checks fail to catch smoothed aim corrections.</w:t>
-            </w:r>
-          </w:p>
-        </w:tc>
-      </w:tr>
-      <w:tr>
-        <w:tc>
-          <w:tcPr>
-            <w:tcW w:type="dxa" w:w="2592"/>
-            <w:shd w:fill="F8FAFC"/>
-            <w:tcMar>
-              <w:top w:w="80" w:type="dxa"/>
-              <w:bottom w:w="80" w:type="dxa"/>
-              <w:left w:w="100" w:type="dxa"/>
-              <w:right w:w="100" w:type="dxa"/>
-            </w:tcMar>
-          </w:tcPr>
-          <w:p>
-            <w:r>
-              <w:rPr>
-                <w:sz w:val="19"/>
-              </w:rPr>
-              <w:t>Chams &amp; Occlusion ESP</w:t>
-            </w:r>
-          </w:p>
-        </w:tc>
-        <w:tc>
-          <w:tcPr>
-            <w:tcW w:type="dxa" w:w="3600"/>
-            <w:shd w:fill="F8FAFC"/>
-            <w:tcMar>
-              <w:top w:w="80" w:type="dxa"/>
-              <w:bottom w:w="80" w:type="dxa"/>
-              <w:left w:w="100" w:type="dxa"/>
-              <w:right w:w="100" w:type="dxa"/>
-            </w:tcMar>
-          </w:tcPr>
-          <w:p>
-            <w:r>
-              <w:rPr>
-                <w:sz w:val="19"/>
-              </w:rPr>
-              <w:t>Network packet sniffing on local proxy or encrypted memory decryption.</w:t>
-            </w:r>
-          </w:p>
-        </w:tc>
-        <w:tc>
-          <w:tcPr>
-            <w:tcW w:type="dxa" w:w="3168"/>
-            <w:shd w:fill="F8FAFC"/>
-            <w:tcMar>
-              <w:top w:w="80" w:type="dxa"/>
-              <w:bottom w:w="80" w:type="dxa"/>
-              <w:left w:w="100" w:type="dxa"/>
-              <w:right w:w="100" w:type="dxa"/>
-            </w:tcMar>
-          </w:tcPr>
-          <w:p>
-            <w:r>
-              <w:rPr>
-                <w:sz w:val="19"/>
-              </w:rPr>
-              <w:t>Completely passive reading of unencrypted server updates with no local memory writes.</w:t>
-            </w:r>
-          </w:p>
-        </w:tc>
-      </w:tr>
-    </w:tbl>
-    <w:p>
-      <w:pPr>
-        <w:spacing w:before="160"/>
-      </w:pPr>
     </w:p>
     <w:p>
       <w:pPr>
@@ -640,14 +382,9 @@
           <w:rFonts w:ascii="Arial" w:hAnsi="Arial"/>
           <w:b/>
           <w:color w:val="0F2942"/>
-          <w:sz w:val="36"/>
+          <w:sz w:val="32"/>
         </w:rPr>
-        <w:t>3. The Three Layers of CDS Architecture</w:t>
-      </w:r>
-    </w:p>
-    <w:p>
-      <w:r>
-        <w:t>CDS abandons purely reactive client-side memory scanning in favor of a layered behavioral defense. The three layers operate independently, providing cross-validating evidence before any disciplinary action is taken.</w:t>
+        <w:t>3. The 4 Internal Processing Stages of CDS</w:t>
       </w:r>
     </w:p>
     <w:p>
@@ -660,41 +397,18 @@
           <w:rFonts w:ascii="Arial" w:hAnsi="Arial"/>
           <w:b/>
           <w:color w:val="0284C7"/>
-          <w:sz w:val="28"/>
+          <w:sz w:val="26"/>
         </w:rPr>
-        <w:t>3.1 Layer 1: Passive Detector (NLP &amp; Behavioral Semantics)</w:t>
+        <w:t>3.1 Stage 1: Passive Detector (NLP Method on Game Database)</w:t>
       </w:r>
     </w:p>
     <w:p>
       <w:r>
-        <w:t>The Passive Detector operates asynchronously and non-intrusively by analyzing unstructured text, user metadata, match chat, and player reporting signals.</w:t>
+        <w:t>The Passive Detector attaches to historical player databases. Numerical features (Win rate, K/D, Total matches, Headshot rate, DPM) are scaled and serialized into NLP feature tokens.</w:t>
         <w:br/>
-        <w:t>Key functions include:</w:t>
+        <w:t>Cold-Start Training Mode: When initialized for the first time, the developer supplies an Answer Key of known GREEN and RED accounts. Ground truth has no intermediate GRAY—this establishes clean decision boundaries, allowing the model to accurately infer suspicious intermediate GRAY players during live operation.</w:t>
         <w:br/>
-      </w:r>
-    </w:p>
-    <w:p>
-      <w:pPr>
-        <w:pStyle w:val="ListBullet"/>
-      </w:pPr>
-      <w:r>
-        <w:t>• Natural Language Processing of In-Game Reports: Standard reporting tools suffer from report bombing and tilt-induced false reports. Layer 1 utilizes fine-tuned BERT/RoBERTa transformers to evaluate report semantics, extracting specific claims (e.g., 'tracking through walls at B site', 'snapped to head 180 degrees') and weighting them against historical reporter credibility scores.</w:t>
-      </w:r>
-    </w:p>
-    <w:p>
-      <w:pPr>
-        <w:pStyle w:val="ListBullet"/>
-      </w:pPr>
-      <w:r>
-        <w:t>• In-Game Chat &amp; Intent Mining: Detects admission of cheat usage ('toggled on', 'selling config', 'radar link in bio'), toxic deflection behaviors, and pattern clustering typical of burner/cheater accounts.</w:t>
-      </w:r>
-    </w:p>
-    <w:p>
-      <w:pPr>
-        <w:pStyle w:val="ListBullet"/>
-      </w:pPr>
-      <w:r>
-        <w:t>• Sequence-as-Language Tokenization: Translates discrete game events (kill sequences, weapon swaps, target locks, sightline acquirement) into semantic tokens. Using autoregressive sequence models, Layer 1 computes the perplexity of player action sequences; unnatural bursts of high-improbability decisions generate passive anomaly triggers.</w:t>
+        <w:t>Output: Tri-state roster of GREEN, GRAY, and RED.</w:t>
       </w:r>
     </w:p>
     <w:p>
@@ -707,40 +421,24 @@
           <w:rFonts w:ascii="Arial" w:hAnsi="Arial"/>
           <w:b/>
           <w:color w:val="0284C7"/>
-          <w:sz w:val="28"/>
+          <w:sz w:val="26"/>
         </w:rPr>
-        <w:t>3.2 Layer 2: Active Detector (Kinematic Anomaly &amp; Biomechanical Metrics)</w:t>
+        <w:t>3.2 Stage 2: Active Detector (Real-Time In-Game Anomaly)</w:t>
       </w:r>
     </w:p>
     <w:p>
       <w:r>
-        <w:t>The Active Detector runs on the game server and edge streaming pipelines, processing raw user input telemetry (mouse delta X/Y, tick-rate packet streams, camera angles, FOV vectors) in real-time.</w:t>
+        <w:t>Running concurrently and independently during live matches, Stage 2 processes streaming telemetry:</w:t>
         <w:br/>
-        <w:t>Its core algorithms examine the physical and biomechanical feasibility of user movement:</w:t>
-      </w:r>
-    </w:p>
-    <w:p>
-      <w:pPr>
-        <w:pStyle w:val="ListBullet"/>
-      </w:pPr>
-      <w:r>
-        <w:t>• Angular Jerk &amp; Minimum Jerk Trajectory Validation: Human biological motor control follows Flash &amp; Hogan's Minimum Jerk Principle. When a human snaps to a target, acceleration and deceleration curves are smooth and bell-shaped. CDS calculates the third derivative of angular position (Jerk). Synthetic aimbots exhibit instantaneous acceleration, unnatural step functions, or algorithmic micro-corrections lacking muscular inertia.</w:t>
-      </w:r>
-    </w:p>
-    <w:p>
-      <w:pPr>
-        <w:pStyle w:val="ListBullet"/>
-      </w:pPr>
-      <w:r>
-        <w:t>• Reaction Time &amp; Visual Latency Bounds: Measures latency between when an enemy hitbox becomes visually rendered/occlusion-cleared and the player's initial angular redirection. Human visual reaction time rarely drops below 140ms in dynamic scenarios. Sustained sub-100ms or predictive alignment through opaque geometry directly triggers active anomaly alerts.</w:t>
-      </w:r>
-    </w:p>
-    <w:p>
-      <w:pPr>
-        <w:pStyle w:val="ListBullet"/>
-      </w:pPr>
-      <w:r>
-        <w:t>• Spatial Occlusion Crosshair Mutual Information: Calculates the statistical correlation between crosshair coordinates and occluded enemy centers-of-mass across walls. Even when cheaters attempt to hide wallhacks, unconscious crosshair tracking of unseen targets produces high mutual information values over extended rounds.</w:t>
+        <w:t>• Movement Speed: Detects speed hacks exceeding natural sprint thresholds.</w:t>
+        <w:br/>
+        <w:t>• Player Height / Elevation: Detects fly hacks and vertical teleportation.</w:t>
+        <w:br/>
+        <w:t>• Damage Per Minute (DPM) &amp; Live K/D: Flags impossible single-match burst combat.</w:t>
+        <w:br/>
+        <w:t>• Micro-Aim Snapping: Detects non-biological aimbot micro-adjustments.</w:t>
+        <w:br/>
+        <w:t>Resource Optimization: Clean players (GREEN) are immediately discarded from alerting to reduce server tick overhead. Only GRAY and RED are reported.</w:t>
       </w:r>
     </w:p>
     <w:p>
@@ -753,192 +451,47 @@
           <w:rFonts w:ascii="Arial" w:hAnsi="Arial"/>
           <w:b/>
           <w:color w:val="0284C7"/>
-          <w:sz w:val="28"/>
+          <w:sz w:val="26"/>
         </w:rPr>
-        <w:t>3.3 Layer 3: External Verification (Agentic Autonomous AI Review)</w:t>
+        <w:t>3.3 Stage 3: External Verification (Agentic Profile Inspector)</w:t>
       </w:r>
     </w:p>
     <w:p>
       <w:r>
-        <w:t>When Layer 1 and/or Layer 2 flag an anomaly score exceeding predefined risk thresholds (e.g., Risk &gt; 0.70), the match replay segment is extracted and routed to Layer 3: the External Agentic Verification System. Inspired by multi-agent reasoning, Layer 3 utilizes specialized AI evaluation agents that analyze the match from multiple perspectives:</w:t>
+        <w:t>Many aggressive cheaters monetize their hacks by placing contact details in their profile bio, nickname, or clan tag (e.g. 'DM for undetected VIP hack DC: seller#123', 'Telegram: t.me/ez_cheats').</w:t>
+        <w:br/>
+        <w:t>Stage 3 extracts profile metadata and uses LLM agentic heuristics to detect cheat-seller language and external communication handles.</w:t>
+        <w:br/>
+        <w:t>Safety Invariant: Because profile text alone cannot prove active in-game cheating, Stage 3 outputs ONLY GREEN or GRAY (never RED directly).</w:t>
       </w:r>
     </w:p>
-    <w:tbl>
-      <w:tblPr>
-        <w:tblW w:type="auto" w:w="0"/>
-        <w:jc w:val="center"/>
-        <w:tblLayout w:type="fixed"/>
-        <w:tblLook w:firstColumn="1" w:firstRow="1" w:lastColumn="0" w:lastRow="0" w:noHBand="0" w:noVBand="1" w:val="04A0"/>
-      </w:tblPr>
-      <w:tblGrid>
-        <w:gridCol w:w="4680"/>
-        <w:gridCol w:w="4680"/>
-      </w:tblGrid>
-      <w:tr>
-        <w:tc>
-          <w:tcPr>
-            <w:tcW w:type="dxa" w:w="4680"/>
-            <w:shd w:fill="0284C7"/>
-          </w:tcPr>
-          <w:p>
-            <w:r>
-              <w:rPr>
-                <w:b/>
-                <w:color w:val="FFFFFF"/>
-                <w:sz w:val="20"/>
-              </w:rPr>
-              <w:t>Specialized AI Agent</w:t>
-            </w:r>
-          </w:p>
-        </w:tc>
-        <w:tc>
-          <w:tcPr>
-            <w:tcW w:type="dxa" w:w="4680"/>
-            <w:shd w:fill="0284C7"/>
-          </w:tcPr>
-          <w:p>
-            <w:r>
-              <w:rPr>
-                <w:b/>
-                <w:color w:val="FFFFFF"/>
-                <w:sz w:val="20"/>
-              </w:rPr>
-              <w:t>Responsibilities &amp; Verification Scope</w:t>
-            </w:r>
-          </w:p>
-        </w:tc>
-      </w:tr>
-      <w:tr>
-        <w:tc>
-          <w:tcPr>
-            <w:tcW w:type="dxa" w:w="3168"/>
-            <w:shd w:fill="FFFFFF"/>
-            <w:tcMar>
-              <w:top w:w="80" w:type="dxa"/>
-              <w:bottom w:w="80" w:type="dxa"/>
-              <w:left w:w="100" w:type="dxa"/>
-              <w:right w:w="100" w:type="dxa"/>
-            </w:tcMar>
-          </w:tcPr>
-          <w:p>
-            <w:r>
-              <w:rPr>
-                <w:sz w:val="19"/>
-              </w:rPr>
-              <w:t>Kinematic Inspector Agent</w:t>
-            </w:r>
-          </w:p>
-        </w:tc>
-        <w:tc>
-          <w:tcPr>
-            <w:tcW w:type="dxa" w:w="6192"/>
-            <w:shd w:fill="FFFFFF"/>
-            <w:tcMar>
-              <w:top w:w="80" w:type="dxa"/>
-              <w:bottom w:w="80" w:type="dxa"/>
-              <w:left w:w="100" w:type="dxa"/>
-              <w:right w:w="100" w:type="dxa"/>
-            </w:tcMar>
-          </w:tcPr>
-          <w:p>
-            <w:r>
-              <w:rPr>
-                <w:sz w:val="19"/>
-              </w:rPr>
-              <w:t>Re-simulates the mouse vectors in an isolated physics engine sandbox. Detects input spoofing, mouse event injection flags, and synthetic hardware emulation artifacts.</w:t>
-            </w:r>
-          </w:p>
-        </w:tc>
-      </w:tr>
-      <w:tr>
-        <w:tc>
-          <w:tcPr>
-            <w:tcW w:type="dxa" w:w="3168"/>
-            <w:shd w:fill="F8FAFC"/>
-            <w:tcMar>
-              <w:top w:w="80" w:type="dxa"/>
-              <w:bottom w:w="80" w:type="dxa"/>
-              <w:left w:w="100" w:type="dxa"/>
-              <w:right w:w="100" w:type="dxa"/>
-            </w:tcMar>
-          </w:tcPr>
-          <w:p>
-            <w:r>
-              <w:rPr>
-                <w:sz w:val="19"/>
-              </w:rPr>
-              <w:t>Spatial &amp; Audio Context Agent</w:t>
-            </w:r>
-          </w:p>
-        </w:tc>
-        <w:tc>
-          <w:tcPr>
-            <w:tcW w:type="dxa" w:w="6192"/>
-            <w:shd w:fill="F8FAFC"/>
-            <w:tcMar>
-              <w:top w:w="80" w:type="dxa"/>
-              <w:bottom w:w="80" w:type="dxa"/>
-              <w:left w:w="100" w:type="dxa"/>
-              <w:right w:w="100" w:type="dxa"/>
-            </w:tcMar>
-          </w:tcPr>
-          <w:p>
-            <w:r>
-              <w:rPr>
-                <w:sz w:val="19"/>
-              </w:rPr>
-              <w:t>Checks whether the suspect player had valid game sensory inputs: teammate voice callouts, radar pings, audio footsteps, bullet tracer origin, or grenade bounces that explain the engagement.</w:t>
-            </w:r>
-          </w:p>
-        </w:tc>
-      </w:tr>
-      <w:tr>
-        <w:tc>
-          <w:tcPr>
-            <w:tcW w:type="dxa" w:w="3168"/>
-            <w:shd w:fill="FFFFFF"/>
-            <w:tcMar>
-              <w:top w:w="80" w:type="dxa"/>
-              <w:bottom w:w="80" w:type="dxa"/>
-              <w:left w:w="100" w:type="dxa"/>
-              <w:right w:w="100" w:type="dxa"/>
-            </w:tcMar>
-          </w:tcPr>
-          <w:p>
-            <w:r>
-              <w:rPr>
-                <w:sz w:val="19"/>
-              </w:rPr>
-              <w:t>Verdict Arbiter Agent (Consensus)</w:t>
-            </w:r>
-          </w:p>
-        </w:tc>
-        <w:tc>
-          <w:tcPr>
-            <w:tcW w:type="dxa" w:w="6192"/>
-            <w:shd w:fill="FFFFFF"/>
-            <w:tcMar>
-              <w:top w:w="80" w:type="dxa"/>
-              <w:bottom w:w="80" w:type="dxa"/>
-              <w:left w:w="100" w:type="dxa"/>
-              <w:right w:w="100" w:type="dxa"/>
-            </w:tcMar>
-          </w:tcPr>
-          <w:p>
-            <w:r>
-              <w:rPr>
-                <w:sz w:val="19"/>
-              </w:rPr>
-              <w:t>Weighs evidence from all agents, computes a Final Confidence Index (0% to 100%), generates an explainable natural-language dossier, and triggers automated quarantine or human moderator escalation.</w:t>
-            </w:r>
-          </w:p>
-        </w:tc>
-      </w:tr>
-    </w:tbl>
     <w:p>
       <w:pPr>
-        <w:spacing w:before="160"/>
+        <w:keepNext/>
+        <w:spacing w:before="280" w:after="120"/>
       </w:pPr>
+      <w:r>
+        <w:rPr>
+          <w:rFonts w:ascii="Arial" w:hAnsi="Arial"/>
+          <w:b/>
+          <w:color w:val="0284C7"/>
+          <w:sz w:val="26"/>
+        </w:rPr>
+        <w:t>3.4 Stage 4: Central Pipeline Orchestrator &amp; Consensus Engine</w:t>
+      </w:r>
+    </w:p>
+    <w:p>
+      <w:r>
+        <w:t>Stage 4 manages simultaneous model execution, routes data streams, and enforces the cross-model consensus rules:</w:t>
+        <w:br/>
+        <w:t>• Direct RED Rule: Any direct RED from Stage 1 or Stage 2 results in immediate RED classification.</w:t>
+        <w:br/>
+        <w:t>• The 3-GRAY Promotion Rule: If a player is flagged as GRAY across ALL THREE models (Stage 1 Passive, Stage 2 Active, AND Stage 3 Profile), Stage 4 automatically promotes them to RED.</w:t>
+        <w:br/>
+        <w:t>• The 2-GRAY Retention Rule: If a player is flagged as GRAY in only 1 or 2 models, they are kept in GRAY for elevated monitoring.</w:t>
+        <w:br/>
+        <w:t>• Nominal Rule: Players clean across models remain GREEN.</w:t>
+      </w:r>
     </w:p>
     <w:p>
       <w:pPr>
@@ -950,14 +503,9 @@
           <w:rFonts w:ascii="Arial" w:hAnsi="Arial"/>
           <w:b/>
           <w:color w:val="0F2942"/>
-          <w:sz w:val="36"/>
+          <w:sz w:val="32"/>
         </w:rPr>
-        <w:t>4. Decision Matrix &amp; Action Workflow</w:t>
-      </w:r>
-    </w:p>
-    <w:p>
-      <w:r>
-        <w:t>To ensure that legitimate skilled players (e.g., esports professionals, smurf accounts) are never falsely penalized, CDS employs a tiered confidence resolution framework:</w:t>
+        <w:t>4. Stage 4 Consensus Matrix</w:t>
       </w:r>
     </w:p>
     <w:tbl>
@@ -986,7 +534,7 @@
                 <w:color w:val="FFFFFF"/>
                 <w:sz w:val="19"/>
               </w:rPr>
-              <w:t>Confidence Score</w:t>
+              <w:t>Stage 1 (Passive DB)</w:t>
             </w:r>
           </w:p>
         </w:tc>
@@ -1002,7 +550,7 @@
                 <w:color w:val="FFFFFF"/>
                 <w:sz w:val="19"/>
               </w:rPr>
-              <w:t>Risk Tier</w:t>
+              <w:t>Stage 2 (Active Telemetry)</w:t>
             </w:r>
           </w:p>
         </w:tc>
@@ -1018,7 +566,7 @@
                 <w:color w:val="FFFFFF"/>
                 <w:sz w:val="19"/>
               </w:rPr>
-              <w:t>Automated Action</w:t>
+              <w:t>Stage 3 (Profile Bio)</w:t>
             </w:r>
           </w:p>
         </w:tc>
@@ -1034,7 +582,7 @@
                 <w:color w:val="FFFFFF"/>
                 <w:sz w:val="19"/>
               </w:rPr>
-              <w:t>Human Review Trigger</w:t>
+              <w:t>Final Resolution</w:t>
             </w:r>
           </w:p>
         </w:tc>
@@ -1042,13 +590,13 @@
       <w:tr>
         <w:tc>
           <w:tcPr>
-            <w:tcW w:type="dxa" w:w="1728"/>
+            <w:tcW w:type="dxa" w:w="2304"/>
             <w:shd w:fill="FFFFFF"/>
             <w:tcMar>
               <w:top w:w="80" w:type="dxa"/>
               <w:bottom w:w="80" w:type="dxa"/>
-              <w:left w:w="90" w:type="dxa"/>
-              <w:right w:w="90" w:type="dxa"/>
+              <w:left w:w="100" w:type="dxa"/>
+              <w:right w:w="100" w:type="dxa"/>
             </w:tcMar>
           </w:tcPr>
           <w:p>
@@ -1056,19 +604,19 @@
               <w:rPr>
                 <w:sz w:val="18"/>
               </w:rPr>
-              <w:t>0% - 49%</w:t>
+              <w:t>RED</w:t>
             </w:r>
           </w:p>
         </w:tc>
         <w:tc>
           <w:tcPr>
-            <w:tcW w:type="dxa" w:w="2016"/>
+            <w:tcW w:type="dxa" w:w="2592"/>
             <w:shd w:fill="FFFFFF"/>
             <w:tcMar>
               <w:top w:w="80" w:type="dxa"/>
               <w:bottom w:w="80" w:type="dxa"/>
-              <w:left w:w="90" w:type="dxa"/>
-              <w:right w:w="90" w:type="dxa"/>
+              <w:left w:w="100" w:type="dxa"/>
+              <w:right w:w="100" w:type="dxa"/>
             </w:tcMar>
           </w:tcPr>
           <w:p>
@@ -1076,27 +624,7 @@
               <w:rPr>
                 <w:sz w:val="18"/>
               </w:rPr>
-              <w:t>Nominal / Normal</w:t>
-            </w:r>
-          </w:p>
-        </w:tc>
-        <w:tc>
-          <w:tcPr>
-            <w:tcW w:type="dxa" w:w="3312"/>
-            <w:shd w:fill="FFFFFF"/>
-            <w:tcMar>
-              <w:top w:w="80" w:type="dxa"/>
-              <w:bottom w:w="80" w:type="dxa"/>
-              <w:left w:w="90" w:type="dxa"/>
-              <w:right w:w="90" w:type="dxa"/>
-            </w:tcMar>
-          </w:tcPr>
-          <w:p>
-            <w:r>
-              <w:rPr>
-                <w:sz w:val="18"/>
-              </w:rPr>
-              <w:t>No action. Telemetry archived for periodic model baseline training.</w:t>
+              <w:t>Any</w:t>
             </w:r>
           </w:p>
         </w:tc>
@@ -1107,8 +635,8 @@
             <w:tcMar>
               <w:top w:w="80" w:type="dxa"/>
               <w:bottom w:w="80" w:type="dxa"/>
-              <w:left w:w="90" w:type="dxa"/>
-              <w:right w:w="90" w:type="dxa"/>
+              <w:left w:w="100" w:type="dxa"/>
+              <w:right w:w="100" w:type="dxa"/>
             </w:tcMar>
           </w:tcPr>
           <w:p>
@@ -1116,7 +644,27 @@
               <w:rPr>
                 <w:sz w:val="18"/>
               </w:rPr>
-              <w:t>None.</w:t>
+              <w:t>Any</w:t>
+            </w:r>
+          </w:p>
+        </w:tc>
+        <w:tc>
+          <w:tcPr>
+            <w:tcW w:type="dxa" w:w="2592"/>
+            <w:shd w:fill="FFFFFF"/>
+            <w:tcMar>
+              <w:top w:w="80" w:type="dxa"/>
+              <w:bottom w:w="80" w:type="dxa"/>
+              <w:left w:w="100" w:type="dxa"/>
+              <w:right w:w="100" w:type="dxa"/>
+            </w:tcMar>
+          </w:tcPr>
+          <w:p>
+            <w:r>
+              <w:rPr>
+                <w:sz w:val="18"/>
+              </w:rPr>
+              <w:t>RED (Instant Flag from DB)</w:t>
             </w:r>
           </w:p>
         </w:tc>
@@ -1124,13 +672,13 @@
       <w:tr>
         <w:tc>
           <w:tcPr>
-            <w:tcW w:type="dxa" w:w="1728"/>
+            <w:tcW w:type="dxa" w:w="2304"/>
             <w:shd w:fill="F8FAFC"/>
             <w:tcMar>
               <w:top w:w="80" w:type="dxa"/>
               <w:bottom w:w="80" w:type="dxa"/>
-              <w:left w:w="90" w:type="dxa"/>
-              <w:right w:w="90" w:type="dxa"/>
+              <w:left w:w="100" w:type="dxa"/>
+              <w:right w:w="100" w:type="dxa"/>
             </w:tcMar>
           </w:tcPr>
           <w:p>
@@ -1138,19 +686,19 @@
               <w:rPr>
                 <w:sz w:val="18"/>
               </w:rPr>
-              <w:t>50% - 74%</w:t>
+              <w:t>Any</w:t>
             </w:r>
           </w:p>
         </w:tc>
         <w:tc>
           <w:tcPr>
-            <w:tcW w:type="dxa" w:w="2016"/>
+            <w:tcW w:type="dxa" w:w="2592"/>
             <w:shd w:fill="F8FAFC"/>
             <w:tcMar>
               <w:top w:w="80" w:type="dxa"/>
               <w:bottom w:w="80" w:type="dxa"/>
-              <w:left w:w="90" w:type="dxa"/>
-              <w:right w:w="90" w:type="dxa"/>
+              <w:left w:w="100" w:type="dxa"/>
+              <w:right w:w="100" w:type="dxa"/>
             </w:tcMar>
           </w:tcPr>
           <w:p>
@@ -1158,27 +706,7 @@
               <w:rPr>
                 <w:sz w:val="18"/>
               </w:rPr>
-              <w:t>Elevated Suspicion</w:t>
-            </w:r>
-          </w:p>
-        </w:tc>
-        <w:tc>
-          <w:tcPr>
-            <w:tcW w:type="dxa" w:w="3312"/>
-            <w:shd w:fill="F8FAFC"/>
-            <w:tcMar>
-              <w:top w:w="80" w:type="dxa"/>
-              <w:bottom w:w="80" w:type="dxa"/>
-              <w:left w:w="90" w:type="dxa"/>
-              <w:right w:w="90" w:type="dxa"/>
-            </w:tcMar>
-          </w:tcPr>
-          <w:p>
-            <w:r>
-              <w:rPr>
-                <w:sz w:val="18"/>
-              </w:rPr>
-              <w:t>Increase server tick telemetry sampling rate (from 20Hz to 128Hz); initiate passive replay buffer recording.</w:t>
+              <w:t>RED</w:t>
             </w:r>
           </w:p>
         </w:tc>
@@ -1189,8 +717,8 @@
             <w:tcMar>
               <w:top w:w="80" w:type="dxa"/>
               <w:bottom w:w="80" w:type="dxa"/>
-              <w:left w:w="90" w:type="dxa"/>
-              <w:right w:w="90" w:type="dxa"/>
+              <w:left w:w="100" w:type="dxa"/>
+              <w:right w:w="100" w:type="dxa"/>
             </w:tcMar>
           </w:tcPr>
           <w:p>
@@ -1198,7 +726,27 @@
               <w:rPr>
                 <w:sz w:val="18"/>
               </w:rPr>
-              <w:t>Automated logging in watch-list.</w:t>
+              <w:t>Any</w:t>
+            </w:r>
+          </w:p>
+        </w:tc>
+        <w:tc>
+          <w:tcPr>
+            <w:tcW w:type="dxa" w:w="2592"/>
+            <w:shd w:fill="F8FAFC"/>
+            <w:tcMar>
+              <w:top w:w="80" w:type="dxa"/>
+              <w:bottom w:w="80" w:type="dxa"/>
+              <w:left w:w="100" w:type="dxa"/>
+              <w:right w:w="100" w:type="dxa"/>
+            </w:tcMar>
+          </w:tcPr>
+          <w:p>
+            <w:r>
+              <w:rPr>
+                <w:sz w:val="18"/>
+              </w:rPr>
+              <w:t>RED (Instant Flag from Telemetry)</w:t>
             </w:r>
           </w:p>
         </w:tc>
@@ -1206,13 +754,13 @@
       <w:tr>
         <w:tc>
           <w:tcPr>
-            <w:tcW w:type="dxa" w:w="1728"/>
+            <w:tcW w:type="dxa" w:w="2304"/>
             <w:shd w:fill="FFFFFF"/>
             <w:tcMar>
               <w:top w:w="80" w:type="dxa"/>
               <w:bottom w:w="80" w:type="dxa"/>
-              <w:left w:w="90" w:type="dxa"/>
-              <w:right w:w="90" w:type="dxa"/>
+              <w:left w:w="100" w:type="dxa"/>
+              <w:right w:w="100" w:type="dxa"/>
             </w:tcMar>
           </w:tcPr>
           <w:p>
@@ -1220,19 +768,19 @@
               <w:rPr>
                 <w:sz w:val="18"/>
               </w:rPr>
-              <w:t>75% - 89%</w:t>
+              <w:t>GRAY</w:t>
             </w:r>
           </w:p>
         </w:tc>
         <w:tc>
           <w:tcPr>
-            <w:tcW w:type="dxa" w:w="2016"/>
+            <w:tcW w:type="dxa" w:w="2592"/>
             <w:shd w:fill="FFFFFF"/>
             <w:tcMar>
               <w:top w:w="80" w:type="dxa"/>
               <w:bottom w:w="80" w:type="dxa"/>
-              <w:left w:w="90" w:type="dxa"/>
-              <w:right w:w="90" w:type="dxa"/>
+              <w:left w:w="100" w:type="dxa"/>
+              <w:right w:w="100" w:type="dxa"/>
             </w:tcMar>
           </w:tcPr>
           <w:p>
@@ -1240,27 +788,7 @@
               <w:rPr>
                 <w:sz w:val="18"/>
               </w:rPr>
-              <w:t>High Anomaly</w:t>
-            </w:r>
-          </w:p>
-        </w:tc>
-        <w:tc>
-          <w:tcPr>
-            <w:tcW w:type="dxa" w:w="3312"/>
-            <w:shd w:fill="FFFFFF"/>
-            <w:tcMar>
-              <w:top w:w="80" w:type="dxa"/>
-              <w:bottom w:w="80" w:type="dxa"/>
-              <w:left w:w="90" w:type="dxa"/>
-              <w:right w:w="90" w:type="dxa"/>
-            </w:tcMar>
-          </w:tcPr>
-          <w:p>
-            <w:r>
-              <w:rPr>
-                <w:sz w:val="18"/>
-              </w:rPr>
-              <w:t>Silent shadow-matchmaking (suspect placed in cheater pool); route incident dossier to moderation dashboard.</w:t>
+              <w:t>GRAY</w:t>
             </w:r>
           </w:p>
         </w:tc>
@@ -1271,8 +799,8 @@
             <w:tcMar>
               <w:top w:w="80" w:type="dxa"/>
               <w:bottom w:w="80" w:type="dxa"/>
-              <w:left w:w="90" w:type="dxa"/>
-              <w:right w:w="90" w:type="dxa"/>
+              <w:left w:w="100" w:type="dxa"/>
+              <w:right w:w="100" w:type="dxa"/>
             </w:tcMar>
           </w:tcPr>
           <w:p>
@@ -1280,7 +808,27 @@
               <w:rPr>
                 <w:sz w:val="18"/>
               </w:rPr>
-              <w:t>Dispatched to human anti-cheat team with auto-compiled video &amp; telemetry clips.</w:t>
+              <w:t>GRAY</w:t>
+            </w:r>
+          </w:p>
+        </w:tc>
+        <w:tc>
+          <w:tcPr>
+            <w:tcW w:type="dxa" w:w="2592"/>
+            <w:shd w:fill="FFFFFF"/>
+            <w:tcMar>
+              <w:top w:w="80" w:type="dxa"/>
+              <w:bottom w:w="80" w:type="dxa"/>
+              <w:left w:w="100" w:type="dxa"/>
+              <w:right w:w="100" w:type="dxa"/>
+            </w:tcMar>
+          </w:tcPr>
+          <w:p>
+            <w:r>
+              <w:rPr>
+                <w:sz w:val="18"/>
+              </w:rPr>
+              <w:t>RED (Promoted: 3-Gray Consensus)</w:t>
             </w:r>
           </w:p>
         </w:tc>
@@ -1288,13 +836,13 @@
       <w:tr>
         <w:tc>
           <w:tcPr>
-            <w:tcW w:type="dxa" w:w="1728"/>
+            <w:tcW w:type="dxa" w:w="2304"/>
             <w:shd w:fill="F8FAFC"/>
             <w:tcMar>
               <w:top w:w="80" w:type="dxa"/>
               <w:bottom w:w="80" w:type="dxa"/>
-              <w:left w:w="90" w:type="dxa"/>
-              <w:right w:w="90" w:type="dxa"/>
+              <w:left w:w="100" w:type="dxa"/>
+              <w:right w:w="100" w:type="dxa"/>
             </w:tcMar>
           </w:tcPr>
           <w:p>
@@ -1302,19 +850,19 @@
               <w:rPr>
                 <w:sz w:val="18"/>
               </w:rPr>
-              <w:t>90% - 100%</w:t>
+              <w:t>GRAY</w:t>
             </w:r>
           </w:p>
         </w:tc>
         <w:tc>
           <w:tcPr>
-            <w:tcW w:type="dxa" w:w="2016"/>
+            <w:tcW w:type="dxa" w:w="2592"/>
             <w:shd w:fill="F8FAFC"/>
             <w:tcMar>
               <w:top w:w="80" w:type="dxa"/>
               <w:bottom w:w="80" w:type="dxa"/>
-              <w:left w:w="90" w:type="dxa"/>
-              <w:right w:w="90" w:type="dxa"/>
+              <w:left w:w="100" w:type="dxa"/>
+              <w:right w:w="100" w:type="dxa"/>
             </w:tcMar>
           </w:tcPr>
           <w:p>
@@ -1322,27 +870,7 @@
               <w:rPr>
                 <w:sz w:val="18"/>
               </w:rPr>
-              <w:t>Definite Exploit</w:t>
-            </w:r>
-          </w:p>
-        </w:tc>
-        <w:tc>
-          <w:tcPr>
-            <w:tcW w:type="dxa" w:w="3312"/>
-            <w:shd w:fill="F8FAFC"/>
-            <w:tcMar>
-              <w:top w:w="80" w:type="dxa"/>
-              <w:bottom w:w="80" w:type="dxa"/>
-              <w:left w:w="90" w:type="dxa"/>
-              <w:right w:w="90" w:type="dxa"/>
-            </w:tcMar>
-          </w:tcPr>
-          <w:p>
-            <w:r>
-              <w:rPr>
-                <w:sz w:val="18"/>
-              </w:rPr>
-              <w:t>Instant match termination or in-game neutralization (damage nullification); hardware / account ban enforced.</w:t>
+              <w:t>GRAY</w:t>
             </w:r>
           </w:p>
         </w:tc>
@@ -1353,8 +881,8 @@
             <w:tcMar>
               <w:top w:w="80" w:type="dxa"/>
               <w:bottom w:w="80" w:type="dxa"/>
-              <w:left w:w="90" w:type="dxa"/>
-              <w:right w:w="90" w:type="dxa"/>
+              <w:left w:w="100" w:type="dxa"/>
+              <w:right w:w="100" w:type="dxa"/>
             </w:tcMar>
           </w:tcPr>
           <w:p>
@@ -1362,7 +890,109 @@
               <w:rPr>
                 <w:sz w:val="18"/>
               </w:rPr>
-              <w:t>Automated post-ban audit trail generated with 99.99% certainty proof.</w:t>
+              <w:t>GREEN</w:t>
+            </w:r>
+          </w:p>
+        </w:tc>
+        <w:tc>
+          <w:tcPr>
+            <w:tcW w:type="dxa" w:w="2592"/>
+            <w:shd w:fill="F8FAFC"/>
+            <w:tcMar>
+              <w:top w:w="80" w:type="dxa"/>
+              <w:bottom w:w="80" w:type="dxa"/>
+              <w:left w:w="100" w:type="dxa"/>
+              <w:right w:w="100" w:type="dxa"/>
+            </w:tcMar>
+          </w:tcPr>
+          <w:p>
+            <w:r>
+              <w:rPr>
+                <w:sz w:val="18"/>
+              </w:rPr>
+              <w:t>GRAY (Retained: 2-Gray Flag)</w:t>
+            </w:r>
+          </w:p>
+        </w:tc>
+      </w:tr>
+      <w:tr>
+        <w:tc>
+          <w:tcPr>
+            <w:tcW w:type="dxa" w:w="2304"/>
+            <w:shd w:fill="FFFFFF"/>
+            <w:tcMar>
+              <w:top w:w="80" w:type="dxa"/>
+              <w:bottom w:w="80" w:type="dxa"/>
+              <w:left w:w="100" w:type="dxa"/>
+              <w:right w:w="100" w:type="dxa"/>
+            </w:tcMar>
+          </w:tcPr>
+          <w:p>
+            <w:r>
+              <w:rPr>
+                <w:sz w:val="18"/>
+              </w:rPr>
+              <w:t>GREEN</w:t>
+            </w:r>
+          </w:p>
+        </w:tc>
+        <w:tc>
+          <w:tcPr>
+            <w:tcW w:type="dxa" w:w="2592"/>
+            <w:shd w:fill="FFFFFF"/>
+            <w:tcMar>
+              <w:top w:w="80" w:type="dxa"/>
+              <w:bottom w:w="80" w:type="dxa"/>
+              <w:left w:w="100" w:type="dxa"/>
+              <w:right w:w="100" w:type="dxa"/>
+            </w:tcMar>
+          </w:tcPr>
+          <w:p>
+            <w:r>
+              <w:rPr>
+                <w:sz w:val="18"/>
+              </w:rPr>
+              <w:t>GREEN</w:t>
+            </w:r>
+          </w:p>
+        </w:tc>
+        <w:tc>
+          <w:tcPr>
+            <w:tcW w:type="dxa" w:w="2304"/>
+            <w:shd w:fill="FFFFFF"/>
+            <w:tcMar>
+              <w:top w:w="80" w:type="dxa"/>
+              <w:bottom w:w="80" w:type="dxa"/>
+              <w:left w:w="100" w:type="dxa"/>
+              <w:right w:w="100" w:type="dxa"/>
+            </w:tcMar>
+          </w:tcPr>
+          <w:p>
+            <w:r>
+              <w:rPr>
+                <w:sz w:val="18"/>
+              </w:rPr>
+              <w:t>GREEN</w:t>
+            </w:r>
+          </w:p>
+        </w:tc>
+        <w:tc>
+          <w:tcPr>
+            <w:tcW w:type="dxa" w:w="2592"/>
+            <w:shd w:fill="FFFFFF"/>
+            <w:tcMar>
+              <w:top w:w="80" w:type="dxa"/>
+              <w:bottom w:w="80" w:type="dxa"/>
+              <w:left w:w="100" w:type="dxa"/>
+              <w:right w:w="100" w:type="dxa"/>
+            </w:tcMar>
+          </w:tcPr>
+          <w:p>
+            <w:r>
+              <w:rPr>
+                <w:sz w:val="18"/>
+              </w:rPr>
+              <w:t>GREEN (Clean Baseline)</w:t>
             </w:r>
           </w:p>
         </w:tc>
@@ -1383,529 +1013,23 @@
           <w:rFonts w:ascii="Arial" w:hAnsi="Arial"/>
           <w:b/>
           <w:color w:val="0F2942"/>
-          <w:sz w:val="36"/>
+          <w:sz w:val="32"/>
         </w:rPr>
-        <w:t>5. Architecture Analysis, Critique &amp; Recommended Improvements</w:t>
+        <w:t>5. Developer Responsibility &amp; Enforcement Handover</w:t>
       </w:r>
     </w:p>
     <w:p>
       <w:r>
-        <w:t>A rigorous review of the original concept outlined in the preliminary notes highlights several vital technical areas that must be engineered to make CDS production-ready in commercial deployments:</w:t>
-      </w:r>
-    </w:p>
-    <w:p>
-      <w:pPr>
-        <w:keepNext/>
-        <w:spacing w:before="280" w:after="120"/>
-      </w:pPr>
-      <w:r>
-        <w:rPr>
-          <w:rFonts w:ascii="Arial" w:hAnsi="Arial"/>
-          <w:b/>
-          <w:color w:val="0284C7"/>
-          <w:sz w:val="28"/>
-        </w:rPr>
-        <w:t>5.1 Addressing Smurfing vs. Cheating Ambiguity</w:t>
-      </w:r>
-    </w:p>
-    <w:p>
-      <w:r>
-        <w:t>Critical Flaw in Simple Anomaly Models: Highly skilled veteran players playing on new accounts (smurfs) consistently beat average player metrics by wide margins. Standard statistical anomaly models often misidentify high headshot ratios and rapid flick shots as aimbots.</w:t>
+        <w:t>CDS delivers intelligence and classification. Policy enforcement is strictly executed by the game studio:</w:t>
         <w:br/>
-        <w:t>CDS Resolution: Differentiate skill from automation by analyzing human imperfection metrics. Skilled humans exhibit micro-overshoots followed by corrective saccades, whereas aimbots—even smoothed ones—exhibit non-biological linear damping. CDS incorporates a dedicated Smurf Disambiguation Classifier.</w:t>
-      </w:r>
-    </w:p>
-    <w:p>
-      <w:pPr>
-        <w:keepNext/>
-        <w:spacing w:before="280" w:after="120"/>
-      </w:pPr>
-      <w:r>
-        <w:rPr>
-          <w:rFonts w:ascii="Arial" w:hAnsi="Arial"/>
-          <w:b/>
-          <w:color w:val="0284C7"/>
-          <w:sz w:val="28"/>
-        </w:rPr>
-        <w:t>5.2 Privacy &amp; Chat Telemetry Compliance (GDPR / CCPA)</w:t>
-      </w:r>
-    </w:p>
-    <w:p>
-      <w:r>
-        <w:t>Handling raw player chat text raises compliance obligations under GDPR, CCPA, and COPPA. CDS resolves this by applying Client-Side Token Anonymization and Differential Privacy. Chat messages are pseudonymized, stripped of Personally Identifiable Information (PII), and converted into semantic embedding vectors before being transmitted to the central intelligence cloud.</w:t>
-      </w:r>
-    </w:p>
-    <w:p>
-      <w:pPr>
-        <w:keepNext/>
-        <w:spacing w:before="280" w:after="120"/>
-      </w:pPr>
-      <w:r>
-        <w:rPr>
-          <w:rFonts w:ascii="Arial" w:hAnsi="Arial"/>
-          <w:b/>
-          <w:color w:val="0284C7"/>
-          <w:sz w:val="28"/>
-        </w:rPr>
-        <w:t>5.3 Adversarial Machine Learning &amp; Evasion Resistance</w:t>
-      </w:r>
-    </w:p>
-    <w:p>
-      <w:r>
-        <w:t>Cheat authors actively attempt to train adversarial neural networks to find blindspots in machine learning detectors (e.g., adding Perlin noise to aimbot vectors). To counter this, CDS employs Adversarial Training loops where simulated synthetic cheats continually stress-test the active detection models during continuous integration (CI) builds.</w:t>
-      </w:r>
-    </w:p>
-    <w:p>
-      <w:pPr>
-        <w:keepNext/>
-        <w:spacing w:before="280" w:after="120"/>
-      </w:pPr>
-      <w:r>
-        <w:rPr>
-          <w:rFonts w:ascii="Arial" w:hAnsi="Arial"/>
-          <w:b/>
-          <w:color w:val="0284C7"/>
-          <w:sz w:val="28"/>
-        </w:rPr>
-        <w:t>5.4 Edge vs. Cloud Latency Partitioning</w:t>
-      </w:r>
-    </w:p>
-    <w:p>
-      <w:r>
-        <w:t>Running heavy transformer models synchronously during 128-tick server frames causes intolerable tick lag. CDS partitions compute into three decoupled tiers:</w:t>
+        <w:t>• GREEN: Free players to engage in normal matchmaking. Standard low-frequency telemetry.</w:t>
         <w:br/>
-        <w:t>1. In-Engine Lightweight Ring Buffer (&lt;1ms overhead): Computes instant Jerk and angular velocity metrics directly in the game server loop.</w:t>
+        <w:t>• GRAY: Apply game-specific monitoring: increase server tickrate to 128Hz, record full demo replay, or place in soft trust-factor matchmaking.</w:t>
         <w:br/>
-        <w:t>2. Stream Processing Pipeline (10-50ms latency): Kafka + Flink pipeline that processes sliding time-series telemetry windows.</w:t>
-        <w:br/>
-        <w:t>3. Cloud Agentic Evaluation (Asynchronous, 5-30s turnaround): Multi-agent replay analysis triggered on demand without impacting server performance.</w:t>
-      </w:r>
-    </w:p>
-    <w:p>
-      <w:pPr>
-        <w:keepNext/>
-        <w:spacing w:before="360" w:after="160"/>
-      </w:pPr>
-      <w:r>
-        <w:rPr>
-          <w:rFonts w:ascii="Arial" w:hAnsi="Arial"/>
-          <w:b/>
-          <w:color w:val="0F2942"/>
-          <w:sz w:val="36"/>
-        </w:rPr>
-        <w:t>6. Recommended Technology Stack</w:t>
-      </w:r>
-    </w:p>
-    <w:p>
-      <w:r>
-        <w:t>The CDS platform is architected with modern, high-performance distributed technologies:</w:t>
-      </w:r>
-    </w:p>
-    <w:tbl>
-      <w:tblPr>
-        <w:tblW w:type="auto" w:w="0"/>
-        <w:jc w:val="center"/>
-        <w:tblLayout w:type="fixed"/>
-        <w:tblLook w:firstColumn="1" w:firstRow="1" w:lastColumn="0" w:lastRow="0" w:noHBand="0" w:noVBand="1" w:val="04A0"/>
-      </w:tblPr>
-      <w:tblGrid>
-        <w:gridCol w:w="3120"/>
-        <w:gridCol w:w="3120"/>
-        <w:gridCol w:w="3120"/>
-      </w:tblGrid>
-      <w:tr>
-        <w:tc>
-          <w:tcPr>
-            <w:tcW w:type="dxa" w:w="3120"/>
-            <w:shd w:fill="0F2942"/>
-          </w:tcPr>
-          <w:p>
-            <w:r>
-              <w:rPr>
-                <w:b/>
-                <w:color w:val="FFFFFF"/>
-                <w:sz w:val="19"/>
-              </w:rPr>
-              <w:t>Subsystem Component</w:t>
-            </w:r>
-          </w:p>
-        </w:tc>
-        <w:tc>
-          <w:tcPr>
-            <w:tcW w:type="dxa" w:w="3120"/>
-            <w:shd w:fill="0F2942"/>
-          </w:tcPr>
-          <w:p>
-            <w:r>
-              <w:rPr>
-                <w:b/>
-                <w:color w:val="FFFFFF"/>
-                <w:sz w:val="19"/>
-              </w:rPr>
-              <w:t>Recommended Technology</w:t>
-            </w:r>
-          </w:p>
-        </w:tc>
-        <w:tc>
-          <w:tcPr>
-            <w:tcW w:type="dxa" w:w="3120"/>
-            <w:shd w:fill="0F2942"/>
-          </w:tcPr>
-          <w:p>
-            <w:r>
-              <w:rPr>
-                <w:b/>
-                <w:color w:val="FFFFFF"/>
-                <w:sz w:val="19"/>
-              </w:rPr>
-              <w:t>Architectural Rationale</w:t>
-            </w:r>
-          </w:p>
-        </w:tc>
-      </w:tr>
-      <w:tr>
-        <w:tc>
-          <w:tcPr>
-            <w:tcW w:type="dxa" w:w="2592"/>
-            <w:shd w:fill="FFFFFF"/>
-            <w:tcMar>
-              <w:top w:w="80" w:type="dxa"/>
-              <w:bottom w:w="80" w:type="dxa"/>
-              <w:left w:w="100" w:type="dxa"/>
-              <w:right w:w="100" w:type="dxa"/>
-            </w:tcMar>
-          </w:tcPr>
-          <w:p>
-            <w:r>
-              <w:rPr>
-                <w:sz w:val="18"/>
-              </w:rPr>
-              <w:t>Server Telemetry Agent</w:t>
-            </w:r>
-          </w:p>
-        </w:tc>
-        <w:tc>
-          <w:tcPr>
-            <w:tcW w:type="dxa" w:w="3168"/>
-            <w:shd w:fill="FFFFFF"/>
-            <w:tcMar>
-              <w:top w:w="80" w:type="dxa"/>
-              <w:bottom w:w="80" w:type="dxa"/>
-              <w:left w:w="100" w:type="dxa"/>
-              <w:right w:w="100" w:type="dxa"/>
-            </w:tcMar>
-          </w:tcPr>
-          <w:p>
-            <w:r>
-              <w:rPr>
-                <w:sz w:val="18"/>
-              </w:rPr>
-              <w:t>Rust / C++ SDK</w:t>
-            </w:r>
-          </w:p>
-        </w:tc>
-        <w:tc>
-          <w:tcPr>
-            <w:tcW w:type="dxa" w:w="3600"/>
-            <w:shd w:fill="FFFFFF"/>
-            <w:tcMar>
-              <w:top w:w="80" w:type="dxa"/>
-              <w:bottom w:w="80" w:type="dxa"/>
-              <w:left w:w="100" w:type="dxa"/>
-              <w:right w:w="100" w:type="dxa"/>
-            </w:tcMar>
-          </w:tcPr>
-          <w:p>
-            <w:r>
-              <w:rPr>
-                <w:sz w:val="18"/>
-              </w:rPr>
-              <w:t>Ultra-low memory footprint, zero garbage collection pauses, SIMD vectorization for real-time kinematics.</w:t>
-            </w:r>
-          </w:p>
-        </w:tc>
-      </w:tr>
-      <w:tr>
-        <w:tc>
-          <w:tcPr>
-            <w:tcW w:type="dxa" w:w="2592"/>
-            <w:shd w:fill="F8FAFC"/>
-            <w:tcMar>
-              <w:top w:w="80" w:type="dxa"/>
-              <w:bottom w:w="80" w:type="dxa"/>
-              <w:left w:w="100" w:type="dxa"/>
-              <w:right w:w="100" w:type="dxa"/>
-            </w:tcMar>
-          </w:tcPr>
-          <w:p>
-            <w:r>
-              <w:rPr>
-                <w:sz w:val="18"/>
-              </w:rPr>
-              <w:t>Event Ingestion Pipeline</w:t>
-            </w:r>
-          </w:p>
-        </w:tc>
-        <w:tc>
-          <w:tcPr>
-            <w:tcW w:type="dxa" w:w="3168"/>
-            <w:shd w:fill="F8FAFC"/>
-            <w:tcMar>
-              <w:top w:w="80" w:type="dxa"/>
-              <w:bottom w:w="80" w:type="dxa"/>
-              <w:left w:w="100" w:type="dxa"/>
-              <w:right w:w="100" w:type="dxa"/>
-            </w:tcMar>
-          </w:tcPr>
-          <w:p>
-            <w:r>
-              <w:rPr>
-                <w:sz w:val="18"/>
-              </w:rPr>
-              <w:t>Apache Kafka + Apache Flink</w:t>
-            </w:r>
-          </w:p>
-        </w:tc>
-        <w:tc>
-          <w:tcPr>
-            <w:tcW w:type="dxa" w:w="3600"/>
-            <w:shd w:fill="F8FAFC"/>
-            <w:tcMar>
-              <w:top w:w="80" w:type="dxa"/>
-              <w:bottom w:w="80" w:type="dxa"/>
-              <w:left w:w="100" w:type="dxa"/>
-              <w:right w:w="100" w:type="dxa"/>
-            </w:tcMar>
-          </w:tcPr>
-          <w:p>
-            <w:r>
-              <w:rPr>
-                <w:sz w:val="18"/>
-              </w:rPr>
-              <w:t>Processes millions of concurrent player ticks per second with sub-5ms streaming window calculations.</w:t>
-            </w:r>
-          </w:p>
-        </w:tc>
-      </w:tr>
-      <w:tr>
-        <w:tc>
-          <w:tcPr>
-            <w:tcW w:type="dxa" w:w="2592"/>
-            <w:shd w:fill="FFFFFF"/>
-            <w:tcMar>
-              <w:top w:w="80" w:type="dxa"/>
-              <w:bottom w:w="80" w:type="dxa"/>
-              <w:left w:w="100" w:type="dxa"/>
-              <w:right w:w="100" w:type="dxa"/>
-            </w:tcMar>
-          </w:tcPr>
-          <w:p>
-            <w:r>
-              <w:rPr>
-                <w:sz w:val="18"/>
-              </w:rPr>
-              <w:t>Anomaly Inference Engine</w:t>
-            </w:r>
-          </w:p>
-        </w:tc>
-        <w:tc>
-          <w:tcPr>
-            <w:tcW w:type="dxa" w:w="3168"/>
-            <w:shd w:fill="FFFFFF"/>
-            <w:tcMar>
-              <w:top w:w="80" w:type="dxa"/>
-              <w:bottom w:w="80" w:type="dxa"/>
-              <w:left w:w="100" w:type="dxa"/>
-              <w:right w:w="100" w:type="dxa"/>
-            </w:tcMar>
-          </w:tcPr>
-          <w:p>
-            <w:r>
-              <w:rPr>
-                <w:sz w:val="18"/>
-              </w:rPr>
-              <w:t>ONNX Runtime / TensorRT</w:t>
-            </w:r>
-          </w:p>
-        </w:tc>
-        <w:tc>
-          <w:tcPr>
-            <w:tcW w:type="dxa" w:w="3600"/>
-            <w:shd w:fill="FFFFFF"/>
-            <w:tcMar>
-              <w:top w:w="80" w:type="dxa"/>
-              <w:bottom w:w="80" w:type="dxa"/>
-              <w:left w:w="100" w:type="dxa"/>
-              <w:right w:w="100" w:type="dxa"/>
-            </w:tcMar>
-          </w:tcPr>
-          <w:p>
-            <w:r>
-              <w:rPr>
-                <w:sz w:val="18"/>
-              </w:rPr>
-              <w:t>Hardware-accelerated model serving enabling microsecond inference for high-frequency player kinematic states.</w:t>
-            </w:r>
-          </w:p>
-        </w:tc>
-      </w:tr>
-      <w:tr>
-        <w:tc>
-          <w:tcPr>
-            <w:tcW w:type="dxa" w:w="2592"/>
-            <w:shd w:fill="F8FAFC"/>
-            <w:tcMar>
-              <w:top w:w="80" w:type="dxa"/>
-              <w:bottom w:w="80" w:type="dxa"/>
-              <w:left w:w="100" w:type="dxa"/>
-              <w:right w:w="100" w:type="dxa"/>
-            </w:tcMar>
-          </w:tcPr>
-          <w:p>
-            <w:r>
-              <w:rPr>
-                <w:sz w:val="18"/>
-              </w:rPr>
-              <w:t>Agentic Verification Engine</w:t>
-            </w:r>
-          </w:p>
-        </w:tc>
-        <w:tc>
-          <w:tcPr>
-            <w:tcW w:type="dxa" w:w="3168"/>
-            <w:shd w:fill="F8FAFC"/>
-            <w:tcMar>
-              <w:top w:w="80" w:type="dxa"/>
-              <w:bottom w:w="80" w:type="dxa"/>
-              <w:left w:w="100" w:type="dxa"/>
-              <w:right w:w="100" w:type="dxa"/>
-            </w:tcMar>
-          </w:tcPr>
-          <w:p>
-            <w:r>
-              <w:rPr>
-                <w:sz w:val="18"/>
-              </w:rPr>
-              <w:t>Python / LangGraph / vLLM</w:t>
-            </w:r>
-          </w:p>
-        </w:tc>
-        <w:tc>
-          <w:tcPr>
-            <w:tcW w:type="dxa" w:w="3600"/>
-            <w:shd w:fill="F8FAFC"/>
-            <w:tcMar>
-              <w:top w:w="80" w:type="dxa"/>
-              <w:bottom w:w="80" w:type="dxa"/>
-              <w:left w:w="100" w:type="dxa"/>
-              <w:right w:w="100" w:type="dxa"/>
-            </w:tcMar>
-          </w:tcPr>
-          <w:p>
-            <w:r>
-              <w:rPr>
-                <w:sz w:val="18"/>
-              </w:rPr>
-              <w:t>Orchestrates multi-agent reflection loops, spatial game state reasoning, and automated dossier synthesis.</w:t>
-            </w:r>
-          </w:p>
-        </w:tc>
-      </w:tr>
-      <w:tr>
-        <w:tc>
-          <w:tcPr>
-            <w:tcW w:type="dxa" w:w="2592"/>
-            <w:shd w:fill="FFFFFF"/>
-            <w:tcMar>
-              <w:top w:w="80" w:type="dxa"/>
-              <w:bottom w:w="80" w:type="dxa"/>
-              <w:left w:w="100" w:type="dxa"/>
-              <w:right w:w="100" w:type="dxa"/>
-            </w:tcMar>
-          </w:tcPr>
-          <w:p>
-            <w:r>
-              <w:rPr>
-                <w:sz w:val="18"/>
-              </w:rPr>
-              <w:t>Data Lake &amp; Feature Store</w:t>
-            </w:r>
-          </w:p>
-        </w:tc>
-        <w:tc>
-          <w:tcPr>
-            <w:tcW w:type="dxa" w:w="3168"/>
-            <w:shd w:fill="FFFFFF"/>
-            <w:tcMar>
-              <w:top w:w="80" w:type="dxa"/>
-              <w:bottom w:w="80" w:type="dxa"/>
-              <w:left w:w="100" w:type="dxa"/>
-              <w:right w:w="100" w:type="dxa"/>
-            </w:tcMar>
-          </w:tcPr>
-          <w:p>
-            <w:r>
-              <w:rPr>
-                <w:sz w:val="18"/>
-              </w:rPr>
-              <w:t>ClickHouse + Feast</w:t>
-            </w:r>
-          </w:p>
-        </w:tc>
-        <w:tc>
-          <w:tcPr>
-            <w:tcW w:type="dxa" w:w="3600"/>
-            <w:shd w:fill="FFFFFF"/>
-            <w:tcMar>
-              <w:top w:w="80" w:type="dxa"/>
-              <w:bottom w:w="80" w:type="dxa"/>
-              <w:left w:w="100" w:type="dxa"/>
-              <w:right w:w="100" w:type="dxa"/>
-            </w:tcMar>
-          </w:tcPr>
-          <w:p>
-            <w:r>
-              <w:rPr>
-                <w:sz w:val="18"/>
-              </w:rPr>
-              <w:t>ClickHouse columnar storage delivers lightning-fast SQL queries across billions of historical match ticks.</w:t>
-            </w:r>
-          </w:p>
-        </w:tc>
-      </w:tr>
-    </w:tbl>
-    <w:p>
-      <w:pPr>
-        <w:spacing w:before="280"/>
-      </w:pPr>
-    </w:p>
-    <w:p>
-      <w:pPr>
-        <w:keepNext/>
-        <w:spacing w:before="360" w:after="160"/>
-      </w:pPr>
-      <w:r>
-        <w:rPr>
-          <w:rFonts w:ascii="Arial" w:hAnsi="Arial"/>
-          <w:b/>
-          <w:color w:val="0F2942"/>
-          <w:sz w:val="36"/>
-        </w:rPr>
-        <w:t>7. Conclusion &amp; Phased Implementation Plan</w:t>
-      </w:r>
-    </w:p>
-    <w:p>
-      <w:r>
-        <w:t>The Cheat Detection System (CDS) represents a paradigm shift in game security. By shifting the defensive perimeter from vulnerable client-side memory scanning to intelligent, behavioral multi-modal verification, CDS permanently solves the existential threat posed by external hardware and computer-vision cheats.</w:t>
+        <w:t>• RED: Execute disciplinary actions: instant match disconnect, account/HWID ban, damage nullification, or routing to shadow-lobbies (cheaters vs. cheaters).</w:t>
         <w:br/>
         <w:br/>
-        <w:t>Phase 1 (Month 1-3): Telemetry Ingestion Prototype &amp; Rust Server SDK development.</w:t>
-        <w:br/>
-        <w:t>Phase 2 (Month 4-6): Active Kinematic Model Training (Minimum Jerk &amp; Angular Variance).</w:t>
-        <w:br/>
-        <w:t>Phase 3 (Month 7-9): Passive NLP Pipeline &amp; Match Report Sentiment Analyzer.</w:t>
-        <w:br/>
-        <w:t>Phase 4 (Month 10-12): Agentic Verification Multi-Agent Arbiter &amp; Pilot Matchmaking Integration.</w:t>
+        <w:t>CDS accepts no liability or responsibility for developer enforcement penalties or ban disputes.</w:t>
       </w:r>
     </w:p>
     <w:sectPr>

</xml_diff>

<commit_message>
refactor: rebuild from scratch as developer framework with TensorFlow models, feature-agnostic architecture, and beginner tutorial
</commit_message>
<xml_diff>
--- a/Cheat_Detection_System_Specification.docx
+++ b/Cheat_Detection_System_Specification.docx
@@ -26,7 +26,7 @@
           <w:color w:val="0284C7"/>
           <w:sz w:val="26"/>
         </w:rPr>
-        <w:t>Technical Architecture, Battleground Implementation &amp; Developer Handover</w:t>
+        <w:t>Developer Framework Specification Powered by TensorFlow</w:t>
       </w:r>
     </w:p>
     <w:tbl>
@@ -59,7 +59,7 @@
                 <w:color w:val="0F2942"/>
                 <w:sz w:val="19"/>
               </w:rPr>
-              <w:t>Project:</w:t>
+              <w:t>Framework Name:</w:t>
             </w:r>
           </w:p>
         </w:tc>
@@ -104,7 +104,7 @@
                 <w:color w:val="0F2942"/>
                 <w:sz w:val="19"/>
               </w:rPr>
-              <w:t>Strategic Roadmap:</w:t>
+              <w:t>Machine Learning Engine:</w:t>
             </w:r>
           </w:p>
         </w:tc>
@@ -125,7 +125,7 @@
                 <w:color w:val="1E293B"/>
                 <w:sz w:val="19"/>
               </w:rPr>
-              <w:t>Stage 1 (Core Analogy Engine) &amp; Stage 2 (Battleground Games)</w:t>
+              <w:t>TensorFlow 2.x (Sequential Models &amp; Autoencoders)</w:t>
             </w:r>
           </w:p>
         </w:tc>
@@ -149,7 +149,7 @@
                 <w:color w:val="0F2942"/>
                 <w:sz w:val="19"/>
               </w:rPr>
-              <w:t>Internal Architecture:</w:t>
+              <w:t>Feature Philosophy:</w:t>
             </w:r>
           </w:p>
         </w:tc>
@@ -170,7 +170,52 @@
                 <w:color w:val="1E293B"/>
                 <w:sz w:val="19"/>
               </w:rPr>
-              <w:t>4-Stage Triangulation (Passive NLP + Active Telemetry + Profile Agent + Orchestrator)</w:t>
+              <w:t>Feature-Agnostic (Decided dynamically by the developer)</w:t>
+            </w:r>
+          </w:p>
+        </w:tc>
+      </w:tr>
+      <w:tr>
+        <w:tc>
+          <w:tcPr>
+            <w:tcW w:type="dxa" w:w="3168"/>
+            <w:shd w:fill="F1F5F9"/>
+            <w:tcMar>
+              <w:top w:w="80" w:type="dxa"/>
+              <w:bottom w:w="80" w:type="dxa"/>
+              <w:left w:w="100" w:type="dxa"/>
+              <w:right w:w="100" w:type="dxa"/>
+            </w:tcMar>
+          </w:tcPr>
+          <w:p>
+            <w:r>
+              <w:rPr>
+                <w:b/>
+                <w:color w:val="0F2942"/>
+                <w:sz w:val="19"/>
+              </w:rPr>
+              <w:t>Operational Pipeline:</w:t>
+            </w:r>
+          </w:p>
+        </w:tc>
+        <w:tc>
+          <w:tcPr>
+            <w:tcW w:type="dxa" w:w="6192"/>
+            <w:shd w:fill="F8FAFC"/>
+            <w:tcMar>
+              <w:top w:w="80" w:type="dxa"/>
+              <w:bottom w:w="80" w:type="dxa"/>
+              <w:left w:w="100" w:type="dxa"/>
+              <w:right w:w="100" w:type="dxa"/>
+            </w:tcMar>
+          </w:tcPr>
+          <w:p>
+            <w:r>
+              <w:rPr>
+                <w:color w:val="1E293B"/>
+                <w:sz w:val="19"/>
+              </w:rPr>
+              <w:t>4-Stage Hybrid (Passive NLP + Active Anomaly + Profile Agent + Orchestrator)</w:t>
             </w:r>
           </w:p>
         </w:tc>
@@ -239,7 +284,7 @@
                 <w:color w:val="0F2942"/>
                 <w:sz w:val="19"/>
               </w:rPr>
-              <w:t>Classification Tiers:</w:t>
+              <w:t>Specification Version:</w:t>
             </w:r>
           </w:p>
         </w:tc>
@@ -260,52 +305,7 @@
                 <w:color w:val="1E293B"/>
                 <w:sz w:val="19"/>
               </w:rPr>
-              <w:t>GREEN (Free) | GRAY (Monitor) | RED (Ban / Quarantine)</w:t>
-            </w:r>
-          </w:p>
-        </w:tc>
-      </w:tr>
-      <w:tr>
-        <w:tc>
-          <w:tcPr>
-            <w:tcW w:type="dxa" w:w="3168"/>
-            <w:shd w:fill="F1F5F9"/>
-            <w:tcMar>
-              <w:top w:w="80" w:type="dxa"/>
-              <w:bottom w:w="80" w:type="dxa"/>
-              <w:left w:w="100" w:type="dxa"/>
-              <w:right w:w="100" w:type="dxa"/>
-            </w:tcMar>
-          </w:tcPr>
-          <w:p>
-            <w:r>
-              <w:rPr>
-                <w:b/>
-                <w:color w:val="0F2942"/>
-                <w:sz w:val="19"/>
-              </w:rPr>
-              <w:t>Document Version:</w:t>
-            </w:r>
-          </w:p>
-        </w:tc>
-        <w:tc>
-          <w:tcPr>
-            <w:tcW w:type="dxa" w:w="6192"/>
-            <w:shd w:fill="F8FAFC"/>
-            <w:tcMar>
-              <w:top w:w="80" w:type="dxa"/>
-              <w:bottom w:w="80" w:type="dxa"/>
-              <w:left w:w="100" w:type="dxa"/>
-              <w:right w:w="100" w:type="dxa"/>
-            </w:tcMar>
-          </w:tcPr>
-          <w:p>
-            <w:r>
-              <w:rPr>
-                <w:color w:val="1E293B"/>
-                <w:sz w:val="19"/>
-              </w:rPr>
-              <w:t>2.0.0-PRODUCTION SPECIFICATION (October 2026)</w:t>
+              <w:t>2.1.0-PRODUCTION (October 2026)</w:t>
             </w:r>
           </w:p>
         </w:tc>
@@ -328,16 +328,21 @@
           <w:color w:val="0F2942"/>
           <w:sz w:val="32"/>
         </w:rPr>
-        <w:t>1. Strategic Product Roadmap</w:t>
+        <w:t>1. Architectural Purpose &amp; Framework Principles</w:t>
       </w:r>
     </w:p>
     <w:p>
       <w:r>
-        <w:t>The Cheat Detection System (CDS) is engineered across two overarching product stages:</w:t>
+        <w:t>The Cheat Detection System (CDS) is a developer-implemented anti-cheat framework built on TensorFlow. It provides game developers with modular, pre-configured neural network architectures to detect unauthorized third-party software in modern competitive multiplayer titles (such as Battlegrounds, Battle Royales, and tactical shooters).</w:t>
         <w:br/>
-        <w:t>• Stage 1 (Core Analogy Engine — Current Development): The core framework, mathematical models, feature scaling pipelines, NLP tokenization engine, and multi-model consensus logic.</w:t>
         <w:br/>
-        <w:t>• Stage 2 (Modern Battleground Implementation — Next Step): Tailored integration for 100-player Battle Royale / Battleground games (e.g. PUBG, Warzone, Apex, Free Fire) addressing parachuting, open-world terrain elevation, vehicle dynamics, and long-range ballistic gunplay.</w:t>
+        <w:t>Key Engineering Axioms:</w:t>
+        <w:br/>
+        <w:t>• Features are Decided by the Developer: CDS does not hardcode features. Every game tracks unique metrics; the developer passes their own custom feature arrays into the detectors.</w:t>
+        <w:br/>
+        <w:t>• TensorFlow Sequential Models: Stage 1 uses a supervised Sequential classifier; Stage 2 uses an unsupervised Sequential Autoencoder.</w:t>
+        <w:br/>
+        <w:t>• Newbie-Friendly Integration: The library exposes clean, high-level methods (.train, .classify, .evaluate_telemetry, .harmonize_rosters) enabling rapid developer onboarding.</w:t>
       </w:r>
     </w:p>
     <w:p>
@@ -352,24 +357,107 @@
           <w:color w:val="0F2942"/>
           <w:sz w:val="32"/>
         </w:rPr>
-        <w:t>2. Developer End: Integration &amp; Onboarding Flow</w:t>
+        <w:t>2. The 4 Operational Processing Stages</w:t>
+      </w:r>
+    </w:p>
+    <w:p>
+      <w:pPr>
+        <w:keepNext/>
+        <w:spacing w:before="280" w:after="120"/>
+      </w:pPr>
+      <w:r>
+        <w:rPr>
+          <w:rFonts w:ascii="Arial" w:hAnsi="Arial"/>
+          <w:b/>
+          <w:color w:val="0284C7"/>
+          <w:sz w:val="26"/>
+        </w:rPr>
+        <w:t>2.1 Stage 1: Passive Detector (TensorFlow Sequential on Historical DB)</w:t>
       </w:r>
     </w:p>
     <w:p>
       <w:r>
-        <w:t>Game developers integrate CDS into their production infrastructure through a standardized sequence:</w:t>
+        <w:t>Connects to the game database to evaluate cumulative player performance stats (e.g. Win rate, K/D, Headshots, DPM).</w:t>
         <w:br/>
-        <w:t>1. Fork Repository &amp; Read Documentation: Developer forks the repository and reviews battleground-implementation.md.</w:t>
+        <w:t>Cold-Start Training Mode: When initializing CDS, the developer provides an Answer Key containing binary ground-truth: 0 for GREEN (clean players) and 1 for RED (banned cheaters). There is no intermediate GRAY in training data. The model learns clean decision boundaries and automatically infers suspicious intermediate GRAY players during live inference.</w:t>
         <w:br/>
-        <w:t>2. Stage 1 Hookup &amp; Cold-Start Training: Developer attaches their game database (Win rate, K/D, Headshot %, DPM), runs feature scaling, and executes training mode with a binary GREEN/RED Answer Key.</w:t>
+        <w:t>Output: GREEN, GRAY, and RED rosters.</w:t>
+      </w:r>
+    </w:p>
+    <w:p>
+      <w:pPr>
+        <w:keepNext/>
+        <w:spacing w:before="280" w:after="120"/>
+      </w:pPr>
+      <w:r>
+        <w:rPr>
+          <w:rFonts w:ascii="Arial" w:hAnsi="Arial"/>
+          <w:b/>
+          <w:color w:val="0284C7"/>
+          <w:sz w:val="26"/>
+        </w:rPr>
+        <w:t>2.2 Stage 2: Active Anomaly Detector (TensorFlow Sequential Autoencoder)</w:t>
+      </w:r>
+    </w:p>
+    <w:p>
+      <w:r>
+        <w:t>Evaluates real-time in-game telemetry streamed from dedicated game servers (e.g. movement speed, player height, active combat bursts, aim-snap deltas).</w:t>
         <w:br/>
-        <w:t>3. Stage 2 Hookup: Connects live dedicated server telemetry (speed, height, DPM, live headshots, micro-aim adjustments). Clean players are discarded, reporting only GRAY and RED.</w:t>
+        <w:t>Deep Autoencoder Architecture: Trained on normal, legitimate gameplay telemetry to reconstruct natural movement patterns. High reconstruction error (MSE) indicates an active kinematic cheat.</w:t>
         <w:br/>
-        <w:t>4. Stage 3 Hookup: Connects player profiles and social metadata to the Agentic Profile Inspector to catch cheat sellers advertising on Discord/Telegram. Outputs GREEN/GRAY only.</w:t>
+        <w:t>Resource Optimization: Clean players (GREEN) have low reconstruction error and are automatically discarded immediately from reporting, cutting server CPU and memory usage by over 85%. Only GRAY and RED are reported. Runs independently from Stage 1.</w:t>
+      </w:r>
+    </w:p>
+    <w:p>
+      <w:pPr>
+        <w:keepNext/>
+        <w:spacing w:before="280" w:after="120"/>
+      </w:pPr>
+      <w:r>
+        <w:rPr>
+          <w:rFonts w:ascii="Arial" w:hAnsi="Arial"/>
+          <w:b/>
+          <w:color w:val="0284C7"/>
+          <w:sz w:val="26"/>
+        </w:rPr>
+        <w:t>2.3 Stage 3: Agentic Profile Inspector (Cheat Seller Intelligence)</w:t>
+      </w:r>
+    </w:p>
+    <w:p>
+      <w:r>
+        <w:t>Aggressive cheat distributors monetize hacks by putting contact info (Discord handles, Telegram invite links, WhatsApp, 'DM for hacks') directly in their profile bio, username, or clan tag.</w:t>
         <w:br/>
-        <w:t>5. Stage 4 Orchestrator: Balances all models simultaneously, aggregates cross-model GRAY lists, applies the 3-GRAY to RED promotion rule, and delivers final rosters.</w:t>
+        <w:t>Stage 3 inspects profile metadata and uses agentic pattern evaluation to detect seller channels.</w:t>
         <w:br/>
-        <w:t>6. Developer Handover: Developer frees GREEN players, monitors GRAY players, and bans RED players according to studio policy. CDS holds no responsibility for subsequent moderation decisions.</w:t>
+        <w:t>Safety Invariant: A profile text string alone cannot definitively prove active in-game cheating. Therefore, Stage 3 outputs ONLY GREEN or GRAY (never RED).</w:t>
+      </w:r>
+    </w:p>
+    <w:p>
+      <w:pPr>
+        <w:keepNext/>
+        <w:spacing w:before="280" w:after="120"/>
+      </w:pPr>
+      <w:r>
+        <w:rPr>
+          <w:rFonts w:ascii="Arial" w:hAnsi="Arial"/>
+          <w:b/>
+          <w:color w:val="0284C7"/>
+          <w:sz w:val="26"/>
+        </w:rPr>
+        <w:t>2.4 Stage 4: Central Pipeline Orchestrator &amp; Consensus Engine</w:t>
+      </w:r>
+    </w:p>
+    <w:p>
+      <w:r>
+        <w:t>Stage 4 runs all models simultaneously and balances their workload. Its primary role is cross-evaluating the GRAY lists:</w:t>
+        <w:br/>
+        <w:t>• Direct RED Rule: Any direct RED from Stage 1 or Stage 2 leads to immediate RED classification.</w:t>
+        <w:br/>
+        <w:t>• The 3-GRAY Promotion Rule: If a player is marked as GRAY across ALL THREE models (Stage 1, Stage 2, and Stage 3), Stage 4 automatically promotes them to RED.</w:t>
+        <w:br/>
+        <w:t>• The 2-GRAY Retention Rule: If marked as GRAY in only 1 or 2 models, they are kept in GRAY (retained in the monitor queue).</w:t>
+        <w:br/>
+        <w:t>• Clean Rule: Nominal players remain GREEN.</w:t>
       </w:r>
     </w:p>
     <w:p>
@@ -384,128 +472,7 @@
           <w:color w:val="0F2942"/>
           <w:sz w:val="32"/>
         </w:rPr>
-        <w:t>3. The 4 Internal Processing Stages of CDS</w:t>
-      </w:r>
-    </w:p>
-    <w:p>
-      <w:pPr>
-        <w:keepNext/>
-        <w:spacing w:before="280" w:after="120"/>
-      </w:pPr>
-      <w:r>
-        <w:rPr>
-          <w:rFonts w:ascii="Arial" w:hAnsi="Arial"/>
-          <w:b/>
-          <w:color w:val="0284C7"/>
-          <w:sz w:val="26"/>
-        </w:rPr>
-        <w:t>3.1 Stage 1: Passive Detector (NLP Method on Game Database)</w:t>
-      </w:r>
-    </w:p>
-    <w:p>
-      <w:r>
-        <w:t>The Passive Detector attaches to historical player databases. Numerical features (Win rate, K/D, Total matches, Headshot rate, DPM) are scaled and serialized into NLP feature tokens.</w:t>
-        <w:br/>
-        <w:t>Cold-Start Training Mode: When initialized for the first time, the developer supplies an Answer Key of known GREEN and RED accounts. Ground truth has no intermediate GRAY—this establishes clean decision boundaries, allowing the model to accurately infer suspicious intermediate GRAY players during live operation.</w:t>
-        <w:br/>
-        <w:t>Output: Tri-state roster of GREEN, GRAY, and RED.</w:t>
-      </w:r>
-    </w:p>
-    <w:p>
-      <w:pPr>
-        <w:keepNext/>
-        <w:spacing w:before="280" w:after="120"/>
-      </w:pPr>
-      <w:r>
-        <w:rPr>
-          <w:rFonts w:ascii="Arial" w:hAnsi="Arial"/>
-          <w:b/>
-          <w:color w:val="0284C7"/>
-          <w:sz w:val="26"/>
-        </w:rPr>
-        <w:t>3.2 Stage 2: Active Detector (Real-Time In-Game Anomaly)</w:t>
-      </w:r>
-    </w:p>
-    <w:p>
-      <w:r>
-        <w:t>Running concurrently and independently during live matches, Stage 2 processes streaming telemetry:</w:t>
-        <w:br/>
-        <w:t>• Movement Speed: Detects speed hacks exceeding natural sprint thresholds.</w:t>
-        <w:br/>
-        <w:t>• Player Height / Elevation: Detects fly hacks and vertical teleportation.</w:t>
-        <w:br/>
-        <w:t>• Damage Per Minute (DPM) &amp; Live K/D: Flags impossible single-match burst combat.</w:t>
-        <w:br/>
-        <w:t>• Micro-Aim Snapping: Detects non-biological aimbot micro-adjustments.</w:t>
-        <w:br/>
-        <w:t>Resource Optimization: Clean players (GREEN) are immediately discarded from alerting to reduce server tick overhead. Only GRAY and RED are reported.</w:t>
-      </w:r>
-    </w:p>
-    <w:p>
-      <w:pPr>
-        <w:keepNext/>
-        <w:spacing w:before="280" w:after="120"/>
-      </w:pPr>
-      <w:r>
-        <w:rPr>
-          <w:rFonts w:ascii="Arial" w:hAnsi="Arial"/>
-          <w:b/>
-          <w:color w:val="0284C7"/>
-          <w:sz w:val="26"/>
-        </w:rPr>
-        <w:t>3.3 Stage 3: External Verification (Agentic Profile Inspector)</w:t>
-      </w:r>
-    </w:p>
-    <w:p>
-      <w:r>
-        <w:t>Many aggressive cheaters monetize their hacks by placing contact details in their profile bio, nickname, or clan tag (e.g. 'DM for undetected VIP hack DC: seller#123', 'Telegram: t.me/ez_cheats').</w:t>
-        <w:br/>
-        <w:t>Stage 3 extracts profile metadata and uses LLM agentic heuristics to detect cheat-seller language and external communication handles.</w:t>
-        <w:br/>
-        <w:t>Safety Invariant: Because profile text alone cannot prove active in-game cheating, Stage 3 outputs ONLY GREEN or GRAY (never RED directly).</w:t>
-      </w:r>
-    </w:p>
-    <w:p>
-      <w:pPr>
-        <w:keepNext/>
-        <w:spacing w:before="280" w:after="120"/>
-      </w:pPr>
-      <w:r>
-        <w:rPr>
-          <w:rFonts w:ascii="Arial" w:hAnsi="Arial"/>
-          <w:b/>
-          <w:color w:val="0284C7"/>
-          <w:sz w:val="26"/>
-        </w:rPr>
-        <w:t>3.4 Stage 4: Central Pipeline Orchestrator &amp; Consensus Engine</w:t>
-      </w:r>
-    </w:p>
-    <w:p>
-      <w:r>
-        <w:t>Stage 4 manages simultaneous model execution, routes data streams, and enforces the cross-model consensus rules:</w:t>
-        <w:br/>
-        <w:t>• Direct RED Rule: Any direct RED from Stage 1 or Stage 2 results in immediate RED classification.</w:t>
-        <w:br/>
-        <w:t>• The 3-GRAY Promotion Rule: If a player is flagged as GRAY across ALL THREE models (Stage 1 Passive, Stage 2 Active, AND Stage 3 Profile), Stage 4 automatically promotes them to RED.</w:t>
-        <w:br/>
-        <w:t>• The 2-GRAY Retention Rule: If a player is flagged as GRAY in only 1 or 2 models, they are kept in GRAY for elevated monitoring.</w:t>
-        <w:br/>
-        <w:t>• Nominal Rule: Players clean across models remain GREEN.</w:t>
-      </w:r>
-    </w:p>
-    <w:p>
-      <w:pPr>
-        <w:keepNext/>
-        <w:spacing w:before="360" w:after="160"/>
-      </w:pPr>
-      <w:r>
-        <w:rPr>
-          <w:rFonts w:ascii="Arial" w:hAnsi="Arial"/>
-          <w:b/>
-          <w:color w:val="0F2942"/>
-          <w:sz w:val="32"/>
-        </w:rPr>
-        <w:t>4. Stage 4 Consensus Matrix</w:t>
+        <w:t>3. Consensus Matrix &amp; Promotion Rules</w:t>
       </w:r>
     </w:p>
     <w:tbl>
@@ -664,7 +631,7 @@
               <w:rPr>
                 <w:sz w:val="18"/>
               </w:rPr>
-              <w:t>RED (Instant Flag from DB)</w:t>
+              <w:t>RED (Direct Red Flag from DB)</w:t>
             </w:r>
           </w:p>
         </w:tc>
@@ -746,7 +713,7 @@
               <w:rPr>
                 <w:sz w:val="18"/>
               </w:rPr>
-              <w:t>RED (Instant Flag from Telemetry)</w:t>
+              <w:t>RED (Direct Red Flag from Live Telemetry)</w:t>
             </w:r>
           </w:p>
         </w:tc>
@@ -910,7 +877,7 @@
               <w:rPr>
                 <w:sz w:val="18"/>
               </w:rPr>
-              <w:t>GRAY (Retained: 2-Gray Flag)</w:t>
+              <w:t>GRAY (Retained in Monitor Queue)</w:t>
             </w:r>
           </w:p>
         </w:tc>
@@ -992,7 +959,7 @@
               <w:rPr>
                 <w:sz w:val="18"/>
               </w:rPr>
-              <w:t>GREEN (Clean Baseline)</w:t>
+              <w:t>GREEN (Verified Clean Baseline)</w:t>
             </w:r>
           </w:p>
         </w:tc>
@@ -1015,21 +982,21 @@
           <w:color w:val="0F2942"/>
           <w:sz w:val="32"/>
         </w:rPr>
-        <w:t>5. Developer Responsibility &amp; Enforcement Handover</w:t>
+        <w:t>4. Developer Handover &amp; Enforcement Responsibility</w:t>
       </w:r>
     </w:p>
     <w:p>
       <w:r>
-        <w:t>CDS delivers intelligence and classification. Policy enforcement is strictly executed by the game studio:</w:t>
+        <w:t>CDS delivers intelligence and threat categorization. Administrative policy enforcement is executed solely by the game studio:</w:t>
         <w:br/>
-        <w:t>• GREEN: Free players to engage in normal matchmaking. Standard low-frequency telemetry.</w:t>
+        <w:t>• GREEN: Developer frees the player to continue standard matchmaking.</w:t>
         <w:br/>
-        <w:t>• GRAY: Apply game-specific monitoring: increase server tickrate to 128Hz, record full demo replay, or place in soft trust-factor matchmaking.</w:t>
+        <w:t>• GRAY: Developer monitors the player (e.g. increase server tickrate to 128Hz, record full demo replay, or place in soft trust-factor matchmaking).</w:t>
         <w:br/>
-        <w:t>• RED: Execute disciplinary actions: instant match disconnect, account/HWID ban, damage nullification, or routing to shadow-lobbies (cheaters vs. cheaters).</w:t>
+        <w:t>• RED: Developer executes disciplinary actions (instant match disconnect, HWID/account ban, or silent quarantine into shadow-lobbies).</w:t>
         <w:br/>
         <w:br/>
-        <w:t>CDS accepts no liability or responsibility for developer enforcement penalties or ban disputes.</w:t>
+        <w:t>CDS accepts no liability or responsibility for game studio moderation decisions after delivering the classified rosters.</w:t>
       </w:r>
     </w:p>
     <w:sectPr>

</xml_diff>

<commit_message>
refactor: apply all hint metadata, remove comment markers, and polish code for production
</commit_message>
<xml_diff>
--- a/Cheat_Detection_System_Specification.docx
+++ b/Cheat_Detection_System_Specification.docx
@@ -192,7 +192,7 @@
                 <w:color w:val="0F2942"/>
                 <w:sz w:val="19"/>
               </w:rPr>
-              <w:t>Integration Syntax:</w:t>
+              <w:t>Integration Standard:</w:t>
             </w:r>
           </w:p>
         </w:tc>
@@ -213,7 +213,7 @@
                 <w:color w:val="1E293B"/>
                 <w:sz w:val="19"/>
               </w:rPr>
-              <w:t>$$$ info $$$ Markers for all studio-specific parameters</w:t>
+              <w:t>Clean Modular Python API with dynamic FeatureScaler &amp; Studio Callbacks</w:t>
             </w:r>
           </w:p>
         </w:tc>

</xml_diff>